<commit_message>
BANTA-Y defense deck with rationale video, rationale video, narration script, SDG icons and MCS section in the paper
</commit_message>
<xml_diff>
--- a/research/where-people-go-dengue/paper/Where-People-Go-Dengue-Goes_MCS-T.docx
+++ b/research/where-people-go-dengue/paper/Where-People-Go-Dengue-Goes_MCS-T.docx
@@ -360,12 +360,22 @@
     </w:p>
     <w:p>
       <w:pPr>
+        <w:pStyle w:val="TOC2"/>
+      </w:pPr>
+      <w:r>
+        <w:t xml:space="preserve">1.9 How Mathematics and Computational Sciences Come into Play</w:t>
+        <w:tab/>
+        <w:t xml:space="preserve">14</w:t>
+      </w:r>
+    </w:p>
+    <w:p>
+      <w:pPr>
         <w:pStyle w:val="TOC1"/>
       </w:pPr>
       <w:r>
         <w:t xml:space="preserve">2. FRAMEWORK</w:t>
         <w:tab/>
-        <w:t xml:space="preserve">14</w:t>
+        <w:t xml:space="preserve">15</w:t>
       </w:r>
     </w:p>
     <w:p>
@@ -375,7 +385,7 @@
       <w:r>
         <w:t xml:space="preserve">2.1 Study Area and Barangays</w:t>
         <w:tab/>
-        <w:t xml:space="preserve">15</w:t>
+        <w:t xml:space="preserve">16</w:t>
       </w:r>
     </w:p>
     <w:p>
@@ -385,7 +395,7 @@
       <w:r>
         <w:t xml:space="preserve">2.2 Where Residents Spend the Day</w:t>
         <w:tab/>
-        <w:t xml:space="preserve">16</w:t>
+        <w:t xml:space="preserve">17</w:t>
       </w:r>
     </w:p>
     <w:p>
@@ -395,7 +405,7 @@
       <w:r>
         <w:t xml:space="preserve">2.3 Mosquitoes and Transmission</w:t>
         <w:tab/>
-        <w:t xml:space="preserve">16</w:t>
+        <w:t xml:space="preserve">17</w:t>
       </w:r>
     </w:p>
     <w:p>
@@ -405,7 +415,7 @@
       <w:r>
         <w:t xml:space="preserve">2.4 The Reproduction Number</w:t>
         <w:tab/>
-        <w:t xml:space="preserve">17</w:t>
+        <w:t xml:space="preserve">18</w:t>
       </w:r>
     </w:p>
     <w:p>
@@ -415,7 +425,7 @@
       <w:r>
         <w:t xml:space="preserve">2.5 How Much Transmission Each Place Carries</w:t>
         <w:tab/>
-        <w:t xml:space="preserve">18</w:t>
+        <w:t xml:space="preserve">19</w:t>
       </w:r>
     </w:p>
     <w:p>
@@ -425,7 +435,7 @@
       <w:r>
         <w:t xml:space="preserve">2.6 Vector Control at Least Cost</w:t>
         <w:tab/>
-        <w:t xml:space="preserve">19</w:t>
+        <w:t xml:space="preserve">20</w:t>
       </w:r>
     </w:p>
     <w:p>
@@ -435,7 +445,7 @@
       <w:r>
         <w:t xml:space="preserve">2.7 Where People Get Infected</w:t>
         <w:tab/>
-        <w:t xml:space="preserve">20</w:t>
+        <w:t xml:space="preserve">21</w:t>
       </w:r>
     </w:p>
     <w:p>
@@ -445,7 +455,7 @@
       <w:r>
         <w:t xml:space="preserve">2.8 The Outbreak Alarm</w:t>
         <w:tab/>
-        <w:t xml:space="preserve">20</w:t>
+        <w:t xml:space="preserve">21</w:t>
       </w:r>
     </w:p>
     <w:p>
@@ -455,7 +465,7 @@
       <w:r>
         <w:t xml:space="preserve">2.9 Seasons</w:t>
         <w:tab/>
-        <w:t xml:space="preserve">21</w:t>
+        <w:t xml:space="preserve">22</w:t>
       </w:r>
     </w:p>
     <w:p>
@@ -465,7 +475,7 @@
       <w:r>
         <w:t xml:space="preserve">2.10 Strategies Compared</w:t>
         <w:tab/>
-        <w:t xml:space="preserve">21</w:t>
+        <w:t xml:space="preserve">22</w:t>
       </w:r>
     </w:p>
     <w:p>
@@ -475,7 +485,7 @@
       <w:r>
         <w:t xml:space="preserve">2.11 Assumptions</w:t>
         <w:tab/>
-        <w:t xml:space="preserve">21</w:t>
+        <w:t xml:space="preserve">22</w:t>
       </w:r>
     </w:p>
     <w:p>
@@ -485,7 +495,7 @@
       <w:r>
         <w:t xml:space="preserve">2.12 Notation</w:t>
         <w:tab/>
-        <w:t xml:space="preserve">22</w:t>
+        <w:t xml:space="preserve">23</w:t>
       </w:r>
     </w:p>
     <w:p>
@@ -495,7 +505,7 @@
       <w:r>
         <w:t xml:space="preserve">3. FINDINGS</w:t>
         <w:tab/>
-        <w:t xml:space="preserve">22</w:t>
+        <w:t xml:space="preserve">23</w:t>
       </w:r>
     </w:p>
     <w:p>
@@ -505,7 +515,7 @@
       <w:r>
         <w:t xml:space="preserve">3.0 Data and Integrity of the Results</w:t>
         <w:tab/>
-        <w:t xml:space="preserve">22</w:t>
+        <w:t xml:space="preserve">23</w:t>
       </w:r>
     </w:p>
     <w:p>
@@ -515,7 +525,7 @@
       <w:r>
         <w:t xml:space="preserve">3.1 General Methods</w:t>
         <w:tab/>
-        <w:t xml:space="preserve">22</w:t>
+        <w:t xml:space="preserve">23</w:t>
       </w:r>
     </w:p>
     <w:p>
@@ -525,7 +535,7 @@
       <w:r>
         <w:t xml:space="preserve">3.2 Theoretical Results</w:t>
         <w:tab/>
-        <w:t xml:space="preserve">23</w:t>
+        <w:t xml:space="preserve">24</w:t>
       </w:r>
     </w:p>
     <w:p>
@@ -535,7 +545,7 @@
       <w:r>
         <w:t xml:space="preserve">3.3 Software Verification</w:t>
         <w:tab/>
-        <w:t xml:space="preserve">28</w:t>
+        <w:t xml:space="preserve">29</w:t>
       </w:r>
     </w:p>
     <w:p>
@@ -545,7 +555,7 @@
       <w:r>
         <w:t xml:space="preserve">3.4 Computational Cost</w:t>
         <w:tab/>
-        <w:t xml:space="preserve">30</w:t>
+        <w:t xml:space="preserve">31</w:t>
       </w:r>
     </w:p>
     <w:p>
@@ -555,7 +565,7 @@
       <w:r>
         <w:t xml:space="preserve">3.5 Worked Instance D1</w:t>
         <w:tab/>
-        <w:t xml:space="preserve">30</w:t>
+        <w:t xml:space="preserve">31</w:t>
       </w:r>
     </w:p>
     <w:p>
@@ -565,7 +575,7 @@
       <w:r>
         <w:t xml:space="preserve">3.5.1 How Much Transmission Each Place Carries</w:t>
         <w:tab/>
-        <w:t xml:space="preserve">31</w:t>
+        <w:t xml:space="preserve">32</w:t>
       </w:r>
     </w:p>
     <w:p>
@@ -575,7 +585,7 @@
       <w:r>
         <w:t xml:space="preserve">3.5.2 Vector Control at Least Cost</w:t>
         <w:tab/>
-        <w:t xml:space="preserve">33</w:t>
+        <w:t xml:space="preserve">34</w:t>
       </w:r>
     </w:p>
     <w:p>
@@ -585,7 +595,7 @@
       <w:r>
         <w:t xml:space="preserve">3.5.3 Where People Got Infected</w:t>
         <w:tab/>
-        <w:t xml:space="preserve">34</w:t>
+        <w:t xml:space="preserve">35</w:t>
       </w:r>
     </w:p>
     <w:p>
@@ -595,7 +605,7 @@
       <w:r>
         <w:t xml:space="preserve">3.5.4 Early Warning</w:t>
         <w:tab/>
-        <w:t xml:space="preserve">34</w:t>
+        <w:t xml:space="preserve">35</w:t>
       </w:r>
     </w:p>
     <w:p>
@@ -605,7 +615,7 @@
       <w:r>
         <w:t xml:space="preserve">3.6 Planned Experiments on the Albay Instance</w:t>
         <w:tab/>
-        <w:t xml:space="preserve">36</w:t>
+        <w:t xml:space="preserve">37</w:t>
       </w:r>
     </w:p>
     <w:p>
@@ -615,7 +625,7 @@
       <w:r>
         <w:t xml:space="preserve">3.6.1 Sensitivity Analysis</w:t>
         <w:tab/>
-        <w:t xml:space="preserve">36</w:t>
+        <w:t xml:space="preserve">37</w:t>
       </w:r>
     </w:p>
     <w:p>
@@ -625,7 +635,7 @@
       <w:r>
         <w:t xml:space="preserve">3.6.2 Statistical Treatment</w:t>
         <w:tab/>
-        <w:t xml:space="preserve">36</w:t>
+        <w:t xml:space="preserve">37</w:t>
       </w:r>
     </w:p>
     <w:p>
@@ -635,7 +645,7 @@
       <w:r>
         <w:t xml:space="preserve">3.6.3 Hypotheses Fixed in Advance</w:t>
         <w:tab/>
-        <w:t xml:space="preserve">36</w:t>
+        <w:t xml:space="preserve">37</w:t>
       </w:r>
     </w:p>
     <w:p>
@@ -645,7 +655,7 @@
       <w:r>
         <w:t xml:space="preserve">3.6.4 Sensitivity Sweeps</w:t>
         <w:tab/>
-        <w:t xml:space="preserve">37</w:t>
+        <w:t xml:space="preserve">38</w:t>
       </w:r>
     </w:p>
     <w:p>
@@ -655,7 +665,7 @@
       <w:r>
         <w:t xml:space="preserve">4. CONCLUSIONS</w:t>
         <w:tab/>
-        <w:t xml:space="preserve">37</w:t>
+        <w:t xml:space="preserve">38</w:t>
       </w:r>
     </w:p>
     <w:p>
@@ -665,7 +675,7 @@
       <w:r>
         <w:t xml:space="preserve">4.1 Summary of the Findings</w:t>
         <w:tab/>
-        <w:t xml:space="preserve">37</w:t>
+        <w:t xml:space="preserve">38</w:t>
       </w:r>
     </w:p>
     <w:p>
@@ -675,7 +685,7 @@
       <w:r>
         <w:t xml:space="preserve">4.2 Limitations</w:t>
         <w:tab/>
-        <w:t xml:space="preserve">39</w:t>
+        <w:t xml:space="preserve">40</w:t>
       </w:r>
     </w:p>
     <w:p>
@@ -685,7 +695,7 @@
       <w:r>
         <w:t xml:space="preserve">4.3 Recommendations and Next Steps</w:t>
         <w:tab/>
-        <w:t xml:space="preserve">40</w:t>
+        <w:t xml:space="preserve">41</w:t>
       </w:r>
     </w:p>
     <w:p>
@@ -695,7 +705,7 @@
       <w:r>
         <w:t xml:space="preserve">4.4 Applications</w:t>
         <w:tab/>
-        <w:t xml:space="preserve">41</w:t>
+        <w:t xml:space="preserve">42</w:t>
       </w:r>
     </w:p>
     <w:p>
@@ -705,7 +715,7 @@
       <w:r>
         <w:t xml:space="preserve">5. REFERENCES</w:t>
         <w:tab/>
-        <w:t xml:space="preserve">42</w:t>
+        <w:t xml:space="preserve">43</w:t>
       </w:r>
     </w:p>
     <w:p>
@@ -715,7 +725,7 @@
       <w:r>
         <w:t xml:space="preserve">APPENDIX A. REGISTER OF PUBLIC DATA SOURCES</w:t>
         <w:tab/>
-        <w:t xml:space="preserve">46</w:t>
+        <w:t xml:space="preserve">47</w:t>
       </w:r>
     </w:p>
     <w:p>
@@ -725,7 +735,7 @@
       <w:r>
         <w:t xml:space="preserve">APPENDIX B. FILES OF THE DATA SET</w:t>
         <w:tab/>
-        <w:t xml:space="preserve">47</w:t>
+        <w:t xml:space="preserve">48</w:t>
       </w:r>
     </w:p>
     <w:p>
@@ -735,7 +745,7 @@
       <w:r>
         <w:t xml:space="preserve">APPENDIX C. MOSQUITO INDEX AND CASE FIELDS</w:t>
         <w:tab/>
-        <w:t xml:space="preserve">47</w:t>
+        <w:t xml:space="preserve">48</w:t>
       </w:r>
     </w:p>
     <w:p>
@@ -745,7 +755,7 @@
       <w:r>
         <w:t xml:space="preserve">APPENDIX D. FEATURES OF THE BANTA-Y APPLICATION</w:t>
         <w:tab/>
-        <w:t xml:space="preserve">48</w:t>
+        <w:t xml:space="preserve">49</w:t>
       </w:r>
     </w:p>
     <w:p>
@@ -755,7 +765,7 @@
       <w:r>
         <w:t xml:space="preserve">APPENDIX E. RISK REGISTER</w:t>
         <w:tab/>
-        <w:t xml:space="preserve">49</w:t>
+        <w:t xml:space="preserve">50</w:t>
       </w:r>
     </w:p>
     <w:p>
@@ -765,7 +775,7 @@
       <w:r>
         <w:t xml:space="preserve">APPENDIX F. HOW TO REPRODUCE EVERY NUMBER</w:t>
         <w:tab/>
-        <w:t xml:space="preserve">49</w:t>
+        <w:t xml:space="preserve">50</w:t>
       </w:r>
     </w:p>
     <w:p>
@@ -775,7 +785,7 @@
       <w:r>
         <w:t xml:space="preserve">ETHICS STATEMENT</w:t>
         <w:tab/>
-        <w:t xml:space="preserve">50</w:t>
+        <w:t xml:space="preserve">51</w:t>
       </w:r>
     </w:p>
     <w:p>
@@ -884,7 +894,7 @@
       </w:r>
     </w:p>
     <w:bookmarkEnd w:id="23"/>
-    <w:bookmarkStart w:id="42" w:name="introduction"/>
+    <w:bookmarkStart w:id="46" w:name="introduction"/>
     <w:p>
       <w:pPr>
         <w:pStyle w:val="Heading1"/>
@@ -3073,7 +3083,7 @@
       </w:r>
     </w:p>
     <w:bookmarkEnd w:id="40"/>
-    <w:bookmarkStart w:id="41" w:name="X10a3649cd34e8909480f97c395bb3707b1b25cb"/>
+    <w:bookmarkStart w:id="44" w:name="X10a3649cd34e8909480f97c395bb3707b1b25cb"/>
     <w:p>
       <w:pPr>
         <w:pStyle w:val="Heading2"/>
@@ -3088,25 +3098,6 @@
       </w:pPr>
       <w:r>
         <w:t xml:space="preserve">SDG 3 (Good Health and Well-being) is the goal served most directly. Target 3.3 calls for ending epidemics of neglected tropical diseases, dengue among them, and target 3.d for stronger early warning and better handling of health risks (United Nations General Assembly [UNGA], 2015). The CUSUM alarm addresses target 3.d, and the least-cost control addresses target 3.3. The hotspot ranking often singles out schools as places of transmission, so target 4.a (safe learning environments) is touched as well, while the open data set relates to target 17.18. None of these links has been measured in practice; they describe intended uses of a model that is still to be field-tested.</w:t>
-      </w:r>
-    </w:p>
-    <w:bookmarkEnd w:id="41"/>
-    <w:bookmarkEnd w:id="42"/>
-    <w:bookmarkStart w:id="94" w:name="framework"/>
-    <w:p>
-      <w:pPr>
-        <w:pStyle w:val="Heading1"/>
-      </w:pPr>
-      <w:r>
-        <w:t xml:space="preserve">2. FRAMEWORK</w:t>
-      </w:r>
-    </w:p>
-    <w:p>
-      <w:pPr>
-        <w:pStyle w:val="FirstParagraph"/>
-      </w:pPr>
-      <w:r>
-        <w:t xml:space="preserve">The model is built in three layers (Figure 1). The movement layer (Sections 2.1 and 2.2) records where the residents of each barangay spend their daylight hours. The transmission layer (Sections 2.3 to 2.5) adds mosquitoes, writes the equations of infection, and extracts the reproduction number and its parts. The decision layer (Sections 2.6 to 2.9) turns those quantities into a control plan, a map of infection places, and an outbreak alarm.</w:t>
       </w:r>
     </w:p>
     <w:p>
@@ -3116,20 +3107,186 @@
       <w:r>
         <w:drawing>
           <wp:inline>
-            <wp:extent cx="5334000" cy="3520439"/>
+            <wp:extent cx="3840480" cy="1225685"/>
             <wp:effectExtent b="0" l="0" r="0" t="0"/>
-            <wp:docPr descr="" title="" id="44" name="Picture"/>
+            <wp:docPr descr="" title="" id="42" name="Picture"/>
             <a:graphic>
               <a:graphicData uri="http://schemas.openxmlformats.org/drawingml/2006/picture">
                 <pic:pic>
                   <pic:nvPicPr>
-                    <pic:cNvPr descr="/home/user/MAP---A/research/where-people-go-dengue/paper/fig_framework.png" id="45" name="Picture"/>
+                    <pic:cNvPr descr="/home/user/MAP---A/research/where-people-go-dengue/paper/fig_sdg.png" id="43" name="Picture"/>
                     <pic:cNvPicPr>
                       <a:picLocks noChangeArrowheads="1" noChangeAspect="1"/>
                     </pic:cNvPicPr>
                   </pic:nvPicPr>
                   <pic:blipFill>
-                    <a:blip r:embed="rId43"/>
+                    <a:blip r:embed="rId41"/>
+                    <a:stretch>
+                      <a:fillRect/>
+                    </a:stretch>
+                  </pic:blipFill>
+                  <pic:spPr bwMode="auto">
+                    <a:xfrm>
+                      <a:off x="0" y="0"/>
+                      <a:ext cx="3840480" cy="1225685"/>
+                    </a:xfrm>
+                    <a:prstGeom prst="rect">
+                      <a:avLst/>
+                    </a:prstGeom>
+                    <a:noFill/>
+                    <a:ln w="9525">
+                      <a:noFill/>
+                      <a:headEnd/>
+                      <a:tailEnd/>
+                    </a:ln>
+                  </pic:spPr>
+                </pic:pic>
+              </a:graphicData>
+            </a:graphic>
+          </wp:inline>
+        </w:drawing>
+      </w:r>
+    </w:p>
+    <w:p>
+      <w:pPr>
+        <w:pStyle w:val="SourceLine"/>
+      </w:pPr>
+      <w:r>
+        <w:t xml:space="preserve">SDG icons: United Nations</w:t>
+      </w:r>
+    </w:p>
+    <w:bookmarkEnd w:id="44"/>
+    <w:bookmarkStart w:id="45" w:name="Xa530e5f306b31b5405447ca7a240a2750115c64"/>
+    <w:p>
+      <w:pPr>
+        <w:pStyle w:val="Heading2"/>
+      </w:pPr>
+      <w:r>
+        <w:t xml:space="preserve">1.9 How Mathematics and Computational Sciences Come into Play</w:t>
+      </w:r>
+    </w:p>
+    <w:p>
+      <w:pPr>
+        <w:pStyle w:val="FirstParagraph"/>
+      </w:pPr>
+      <w:r>
+        <w:t xml:space="preserve">This is a study in Mathematics and Computational Sciences in a precise sense: each of its three parts does work that the other two cannot.</w:t>
+      </w:r>
+    </w:p>
+    <w:p>
+      <w:pPr>
+        <w:numPr>
+          <w:ilvl w:val="0"/>
+          <w:numId w:val="1004"/>
+        </w:numPr>
+        <w:pStyle w:val="Compact"/>
+      </w:pPr>
+      <w:r>
+        <w:rPr>
+          <w:bCs/>
+          <w:b/>
+        </w:rPr>
+        <w:t xml:space="preserve">Mathematics</w:t>
+      </w:r>
+      <w:r>
+        <w:t xml:space="preserve"> </w:t>
+      </w:r>
+      <w:r>
+        <w:t xml:space="preserve">states the problem exactly. Daily movement becomes a residence-time matrix, transmission becomes a symmetric matrix whose largest eigenvalue is the reproduction number, and the cheapest effective control becomes a convex program. Twelve propositions then fix what the model guarantees.</w:t>
+      </w:r>
+    </w:p>
+    <w:p>
+      <w:pPr>
+        <w:numPr>
+          <w:ilvl w:val="0"/>
+          <w:numId w:val="1004"/>
+        </w:numPr>
+        <w:pStyle w:val="Compact"/>
+      </w:pPr>
+      <w:r>
+        <w:rPr>
+          <w:bCs/>
+          <w:b/>
+        </w:rPr>
+        <w:t xml:space="preserve">Computation</w:t>
+      </w:r>
+      <w:r>
+        <w:t xml:space="preserve"> </w:t>
+      </w:r>
+      <w:r>
+        <w:t xml:space="preserve">turns those statements into answers. An eigen-solver gives the reproduction number and the place shares for all 720 barangays in under a second, an interior-point method finds the least-cost plan with a certified gap, and a Markov chain gives the exact run length of the alarm.</w:t>
+      </w:r>
+    </w:p>
+    <w:p>
+      <w:pPr>
+        <w:numPr>
+          <w:ilvl w:val="0"/>
+          <w:numId w:val="1004"/>
+        </w:numPr>
+        <w:pStyle w:val="Compact"/>
+      </w:pPr>
+      <w:r>
+        <w:rPr>
+          <w:bCs/>
+          <w:b/>
+        </w:rPr>
+        <w:t xml:space="preserve">Science</w:t>
+      </w:r>
+      <w:r>
+        <w:t xml:space="preserve"> </w:t>
+      </w:r>
+      <w:r>
+        <w:t xml:space="preserve">keeps the work honest. Inputs come from public registers and published parameter ranges, every proposition was tested against separately written code, and every number in Chapter 3 is reproduced by one seeded script.</w:t>
+      </w:r>
+    </w:p>
+    <w:p>
+      <w:pPr>
+        <w:pStyle w:val="FirstParagraph"/>
+      </w:pPr>
+      <w:r>
+        <w:t xml:space="preserve">Together the three move from open data to a matrix, from the matrix to an algorithm, from the algorithm to numbers, and from the numbers to a control plan that is both cheapest and proven (Figure 1).</w:t>
+      </w:r>
+    </w:p>
+    <w:bookmarkEnd w:id="45"/>
+    <w:bookmarkEnd w:id="46"/>
+    <w:bookmarkStart w:id="98" w:name="framework"/>
+    <w:p>
+      <w:pPr>
+        <w:pStyle w:val="Heading1"/>
+      </w:pPr>
+      <w:r>
+        <w:t xml:space="preserve">2. FRAMEWORK</w:t>
+      </w:r>
+    </w:p>
+    <w:p>
+      <w:pPr>
+        <w:pStyle w:val="FirstParagraph"/>
+      </w:pPr>
+      <w:r>
+        <w:t xml:space="preserve">The model is built in three layers (Figure 1). The movement layer (Sections 2.1 and 2.2) records where the residents of each barangay spend their daylight hours. The transmission layer (Sections 2.3 to 2.5) adds mosquitoes, writes the equations of infection, and extracts the reproduction number and its parts. The decision layer (Sections 2.6 to 2.9) turns those quantities into a control plan, a map of infection places, and an outbreak alarm.</w:t>
+      </w:r>
+    </w:p>
+    <w:p>
+      <w:pPr>
+        <w:pStyle w:val="FigurePara"/>
+      </w:pPr>
+      <w:r>
+        <w:drawing>
+          <wp:inline>
+            <wp:extent cx="5334000" cy="3520439"/>
+            <wp:effectExtent b="0" l="0" r="0" t="0"/>
+            <wp:docPr descr="" title="" id="48" name="Picture"/>
+            <a:graphic>
+              <a:graphicData uri="http://schemas.openxmlformats.org/drawingml/2006/picture">
+                <pic:pic>
+                  <pic:nvPicPr>
+                    <pic:cNvPr descr="/home/user/MAP---A/research/where-people-go-dengue/paper/fig_framework.png" id="49" name="Picture"/>
+                    <pic:cNvPicPr>
+                      <a:picLocks noChangeArrowheads="1" noChangeAspect="1"/>
+                    </pic:cNvPicPr>
+                  </pic:nvPicPr>
+                  <pic:blipFill>
+                    <a:blip r:embed="rId47"/>
                     <a:stretch>
                       <a:fillRect/>
                     </a:stretch>
@@ -3174,7 +3331,7 @@
         <w:t xml:space="preserve">From open data to dengue decisions. The movement layer is drawn in blue, the transmission layer in orange, and the decision layer in green.</w:t>
       </w:r>
     </w:p>
-    <w:bookmarkStart w:id="46" w:name="study-area-and-barangays"/>
+    <w:bookmarkStart w:id="50" w:name="study-area-and-barangays"/>
     <w:p>
       <w:pPr>
         <w:pStyle w:val="Heading2"/>
@@ -3616,8 +3773,8 @@
         <w:t xml:space="preserve">= 0.</w:t>
       </w:r>
     </w:p>
-    <w:bookmarkEnd w:id="46"/>
-    <w:bookmarkStart w:id="53" w:name="where-residents-spend-the-day"/>
+    <w:bookmarkEnd w:id="50"/>
+    <w:bookmarkStart w:id="57" w:name="where-residents-spend-the-day"/>
     <w:p>
       <w:pPr>
         <w:pStyle w:val="Heading2"/>
@@ -3728,18 +3885,18 @@
                 <wp:inline>
                   <wp:extent cx="1773936" cy="414528"/>
                   <wp:effectExtent b="0" l="0" r="0" t="0"/>
-                  <wp:docPr descr="" title="" id="48" name="Picture"/>
+                  <wp:docPr descr="" title="" id="52" name="Picture"/>
                   <a:graphic>
                     <a:graphicData uri="http://schemas.openxmlformats.org/drawingml/2006/picture">
                       <pic:pic>
                         <pic:nvPicPr>
-                          <pic:cNvPr descr="/home/user/MAP---A/research/where-people-go-dengue/paper/eq/eq_43a795cbf4bde72d.png" id="49" name="Picture"/>
+                          <pic:cNvPr descr="/home/user/MAP---A/research/where-people-go-dengue/paper/eq/eq_43a795cbf4bde72d.png" id="53" name="Picture"/>
                           <pic:cNvPicPr>
                             <a:picLocks noChangeArrowheads="1" noChangeAspect="1"/>
                           </pic:cNvPicPr>
                         </pic:nvPicPr>
                         <pic:blipFill>
-                          <a:blip r:embed="rId47"/>
+                          <a:blip r:embed="rId51"/>
                           <a:stretch>
                             <a:fillRect/>
                           </a:stretch>
@@ -3964,18 +4121,18 @@
                 <wp:inline>
                   <wp:extent cx="3456431" cy="292607"/>
                   <wp:effectExtent b="0" l="0" r="0" t="0"/>
-                  <wp:docPr descr="" title="" id="51" name="Picture"/>
+                  <wp:docPr descr="" title="" id="55" name="Picture"/>
                   <a:graphic>
                     <a:graphicData uri="http://schemas.openxmlformats.org/drawingml/2006/picture">
                       <pic:pic>
                         <pic:nvPicPr>
-                          <pic:cNvPr descr="/home/user/MAP---A/research/where-people-go-dengue/paper/eq/eq_72f9a699444c9299.png" id="52" name="Picture"/>
+                          <pic:cNvPr descr="/home/user/MAP---A/research/where-people-go-dengue/paper/eq/eq_72f9a699444c9299.png" id="56" name="Picture"/>
                           <pic:cNvPicPr>
                             <a:picLocks noChangeArrowheads="1" noChangeAspect="1"/>
                           </pic:cNvPicPr>
                         </pic:nvPicPr>
                         <pic:blipFill>
-                          <a:blip r:embed="rId50"/>
+                          <a:blip r:embed="rId54"/>
                           <a:stretch>
                             <a:fillRect/>
                           </a:stretch>
@@ -4091,8 +4248,8 @@
         <w:t xml:space="preserve">during biting hours: residents who stay plus visitors who come. A town center with a large school can host far more people by day than live there.</w:t>
       </w:r>
     </w:p>
-    <w:bookmarkEnd w:id="53"/>
-    <w:bookmarkStart w:id="60" w:name="mosquitoes-and-transmission"/>
+    <w:bookmarkEnd w:id="57"/>
+    <w:bookmarkStart w:id="64" w:name="mosquitoes-and-transmission"/>
     <w:p>
       <w:pPr>
         <w:pStyle w:val="Heading2"/>
@@ -4187,18 +4344,18 @@
                 <wp:inline>
                   <wp:extent cx="523951" cy="359454"/>
                   <wp:effectExtent b="0" l="0" r="0" t="0"/>
-                  <wp:docPr descr="" title="" id="55" name="Picture"/>
+                  <wp:docPr descr="" title="" id="59" name="Picture"/>
                   <a:graphic>
                     <a:graphicData uri="http://schemas.openxmlformats.org/drawingml/2006/picture">
                       <pic:pic>
                         <pic:nvPicPr>
-                          <pic:cNvPr descr="/home/user/MAP---A/research/where-people-go-dengue/paper/eq/eq_7942a22231febe03.png" id="56" name="Picture"/>
+                          <pic:cNvPr descr="/home/user/MAP---A/research/where-people-go-dengue/paper/eq/eq_7942a22231febe03.png" id="60" name="Picture"/>
                           <pic:cNvPicPr>
                             <a:picLocks noChangeArrowheads="1" noChangeAspect="1"/>
                           </pic:cNvPicPr>
                         </pic:nvPicPr>
                         <pic:blipFill>
-                          <a:blip r:embed="rId54"/>
+                          <a:blip r:embed="rId58"/>
                           <a:stretch>
                             <a:fillRect/>
                           </a:stretch>
@@ -4702,18 +4859,18 @@
                 <wp:inline>
                   <wp:extent cx="3806647" cy="1264818"/>
                   <wp:effectExtent b="0" l="0" r="0" t="0"/>
-                  <wp:docPr descr="" title="" id="58" name="Picture"/>
+                  <wp:docPr descr="" title="" id="62" name="Picture"/>
                   <a:graphic>
                     <a:graphicData uri="http://schemas.openxmlformats.org/drawingml/2006/picture">
                       <pic:pic>
                         <pic:nvPicPr>
-                          <pic:cNvPr descr="/home/user/MAP---A/research/where-people-go-dengue/paper/eq/eq_3d9a79fcc5dd825d.png" id="59" name="Picture"/>
+                          <pic:cNvPr descr="/home/user/MAP---A/research/where-people-go-dengue/paper/eq/eq_3d9a79fcc5dd825d.png" id="63" name="Picture"/>
                           <pic:cNvPicPr>
                             <a:picLocks noChangeArrowheads="1" noChangeAspect="1"/>
                           </pic:cNvPicPr>
                         </pic:nvPicPr>
                         <pic:blipFill>
-                          <a:blip r:embed="rId57"/>
+                          <a:blip r:embed="rId61"/>
                           <a:stretch>
                             <a:fillRect/>
                           </a:stretch>
@@ -5391,8 +5548,8 @@
         </w:tc>
       </w:tr>
     </w:tbl>
-    <w:bookmarkEnd w:id="60"/>
-    <w:bookmarkStart w:id="67" w:name="the-reproduction-number"/>
+    <w:bookmarkEnd w:id="64"/>
+    <w:bookmarkStart w:id="71" w:name="the-reproduction-number"/>
     <w:p>
       <w:pPr>
         <w:pStyle w:val="Heading2"/>
@@ -5587,18 +5744,18 @@
                 <wp:inline>
                   <wp:extent cx="5212080" cy="395339"/>
                   <wp:effectExtent b="0" l="0" r="0" t="0"/>
-                  <wp:docPr descr="" title="" id="62" name="Picture"/>
+                  <wp:docPr descr="" title="" id="66" name="Picture"/>
                   <a:graphic>
                     <a:graphicData uri="http://schemas.openxmlformats.org/drawingml/2006/picture">
                       <pic:pic>
                         <pic:nvPicPr>
-                          <pic:cNvPr descr="/home/user/MAP---A/research/where-people-go-dengue/paper/eq/eq_a5fc3f218ba02ec6.png" id="63" name="Picture"/>
+                          <pic:cNvPr descr="/home/user/MAP---A/research/where-people-go-dengue/paper/eq/eq_a5fc3f218ba02ec6.png" id="67" name="Picture"/>
                           <pic:cNvPicPr>
                             <a:picLocks noChangeArrowheads="1" noChangeAspect="1"/>
                           </pic:cNvPicPr>
                         </pic:nvPicPr>
                         <pic:blipFill>
-                          <a:blip r:embed="rId61"/>
+                          <a:blip r:embed="rId65"/>
                           <a:stretch>
                             <a:fillRect/>
                           </a:stretch>
@@ -5869,18 +6026,18 @@
                 <wp:inline>
                   <wp:extent cx="996696" cy="310896"/>
                   <wp:effectExtent b="0" l="0" r="0" t="0"/>
-                  <wp:docPr descr="" title="" id="65" name="Picture"/>
+                  <wp:docPr descr="" title="" id="69" name="Picture"/>
                   <a:graphic>
                     <a:graphicData uri="http://schemas.openxmlformats.org/drawingml/2006/picture">
                       <pic:pic>
                         <pic:nvPicPr>
-                          <pic:cNvPr descr="/home/user/MAP---A/research/where-people-go-dengue/paper/eq/eq_df86dd9201e36c90.png" id="66" name="Picture"/>
+                          <pic:cNvPr descr="/home/user/MAP---A/research/where-people-go-dengue/paper/eq/eq_df86dd9201e36c90.png" id="70" name="Picture"/>
                           <pic:cNvPicPr>
                             <a:picLocks noChangeArrowheads="1" noChangeAspect="1"/>
                           </pic:cNvPicPr>
                         </pic:nvPicPr>
                         <pic:blipFill>
-                          <a:blip r:embed="rId64"/>
+                          <a:blip r:embed="rId68"/>
                           <a:stretch>
                             <a:fillRect/>
                           </a:stretch>
@@ -5980,8 +6137,8 @@
         <w:t xml:space="preserve">and the densities of the places its residents visit.</w:t>
       </w:r>
     </w:p>
-    <w:bookmarkEnd w:id="67"/>
-    <w:bookmarkStart w:id="71" w:name="how-much-transmission-each-place-carries"/>
+    <w:bookmarkEnd w:id="71"/>
+    <w:bookmarkStart w:id="75" w:name="how-much-transmission-each-place-carries"/>
     <w:p>
       <w:pPr>
         <w:pStyle w:val="Heading2"/>
@@ -6208,18 +6365,18 @@
                 <wp:inline>
                   <wp:extent cx="3401568" cy="441960"/>
                   <wp:effectExtent b="0" l="0" r="0" t="0"/>
-                  <wp:docPr descr="" title="" id="69" name="Picture"/>
+                  <wp:docPr descr="" title="" id="73" name="Picture"/>
                   <a:graphic>
                     <a:graphicData uri="http://schemas.openxmlformats.org/drawingml/2006/picture">
                       <pic:pic>
                         <pic:nvPicPr>
-                          <pic:cNvPr descr="/home/user/MAP---A/research/where-people-go-dengue/paper/eq/eq_fb72d4061fa4bd1b.png" id="70" name="Picture"/>
+                          <pic:cNvPr descr="/home/user/MAP---A/research/where-people-go-dengue/paper/eq/eq_fb72d4061fa4bd1b.png" id="74" name="Picture"/>
                           <pic:cNvPicPr>
                             <a:picLocks noChangeArrowheads="1" noChangeAspect="1"/>
                           </pic:cNvPicPr>
                         </pic:nvPicPr>
                         <pic:blipFill>
-                          <a:blip r:embed="rId68"/>
+                          <a:blip r:embed="rId72"/>
                           <a:stretch>
                             <a:fillRect/>
                           </a:stretch>
@@ -6348,8 +6505,8 @@
         <w:t xml:space="preserve">lowers the reproduction number by much.</w:t>
       </w:r>
     </w:p>
-    <w:bookmarkEnd w:id="71"/>
-    <w:bookmarkStart w:id="81" w:name="vector-control-at-least-cost"/>
+    <w:bookmarkEnd w:id="75"/>
+    <w:bookmarkStart w:id="85" w:name="vector-control-at-least-cost"/>
     <w:p>
       <w:pPr>
         <w:pStyle w:val="Heading2"/>
@@ -6546,18 +6703,18 @@
                 <wp:inline>
                   <wp:extent cx="2581351" cy="310859"/>
                   <wp:effectExtent b="0" l="0" r="0" t="0"/>
-                  <wp:docPr descr="" title="" id="73" name="Picture"/>
+                  <wp:docPr descr="" title="" id="77" name="Picture"/>
                   <a:graphic>
                     <a:graphicData uri="http://schemas.openxmlformats.org/drawingml/2006/picture">
                       <pic:pic>
                         <pic:nvPicPr>
-                          <pic:cNvPr descr="/home/user/MAP---A/research/where-people-go-dengue/paper/eq/eq_d2e1f78dc896a1fe.png" id="74" name="Picture"/>
+                          <pic:cNvPr descr="/home/user/MAP---A/research/where-people-go-dengue/paper/eq/eq_d2e1f78dc896a1fe.png" id="78" name="Picture"/>
                           <pic:cNvPicPr>
                             <a:picLocks noChangeArrowheads="1" noChangeAspect="1"/>
                           </pic:cNvPicPr>
                         </pic:nvPicPr>
                         <pic:blipFill>
-                          <a:blip r:embed="rId72"/>
+                          <a:blip r:embed="rId76"/>
                           <a:stretch>
                             <a:fillRect/>
                           </a:stretch>
@@ -6764,18 +6921,18 @@
                 <wp:inline>
                   <wp:extent cx="3148279" cy="310865"/>
                   <wp:effectExtent b="0" l="0" r="0" t="0"/>
-                  <wp:docPr descr="" title="" id="76" name="Picture"/>
+                  <wp:docPr descr="" title="" id="80" name="Picture"/>
                   <a:graphic>
                     <a:graphicData uri="http://schemas.openxmlformats.org/drawingml/2006/picture">
                       <pic:pic>
                         <pic:nvPicPr>
-                          <pic:cNvPr descr="/home/user/MAP---A/research/where-people-go-dengue/paper/eq/eq_5ef5ac3dadfd1e0c.png" id="77" name="Picture"/>
+                          <pic:cNvPr descr="/home/user/MAP---A/research/where-people-go-dengue/paper/eq/eq_5ef5ac3dadfd1e0c.png" id="81" name="Picture"/>
                           <pic:cNvPicPr>
                             <a:picLocks noChangeArrowheads="1" noChangeAspect="1"/>
                           </pic:cNvPicPr>
                         </pic:nvPicPr>
                         <pic:blipFill>
-                          <a:blip r:embed="rId75"/>
+                          <a:blip r:embed="rId79"/>
                           <a:stretch>
                             <a:fillRect/>
                           </a:stretch>
@@ -6908,18 +7065,18 @@
                 <wp:inline>
                   <wp:extent cx="4693615" cy="320019"/>
                   <wp:effectExtent b="0" l="0" r="0" t="0"/>
-                  <wp:docPr descr="" title="" id="79" name="Picture"/>
+                  <wp:docPr descr="" title="" id="83" name="Picture"/>
                   <a:graphic>
                     <a:graphicData uri="http://schemas.openxmlformats.org/drawingml/2006/picture">
                       <pic:pic>
                         <pic:nvPicPr>
-                          <pic:cNvPr descr="/home/user/MAP---A/research/where-people-go-dengue/paper/eq/eq_a5d1f51ade188480.png" id="80" name="Picture"/>
+                          <pic:cNvPr descr="/home/user/MAP---A/research/where-people-go-dengue/paper/eq/eq_a5d1f51ade188480.png" id="84" name="Picture"/>
                           <pic:cNvPicPr>
                             <a:picLocks noChangeArrowheads="1" noChangeAspect="1"/>
                           </pic:cNvPicPr>
                         </pic:nvPicPr>
                         <pic:blipFill>
-                          <a:blip r:embed="rId78"/>
+                          <a:blip r:embed="rId82"/>
                           <a:stretch>
                             <a:fillRect/>
                           </a:stretch>
@@ -7125,8 +7282,8 @@
         <w:t xml:space="preserve">10  return u, lower, upper</w:t>
       </w:r>
     </w:p>
-    <w:bookmarkEnd w:id="81"/>
-    <w:bookmarkStart w:id="85" w:name="where-people-get-infected"/>
+    <w:bookmarkEnd w:id="85"/>
+    <w:bookmarkStart w:id="89" w:name="where-people-get-infected"/>
     <w:p>
       <w:pPr>
         <w:pStyle w:val="Heading2"/>
@@ -7279,18 +7436,18 @@
                 <wp:inline>
                   <wp:extent cx="2468880" cy="176784"/>
                   <wp:effectExtent b="0" l="0" r="0" t="0"/>
-                  <wp:docPr descr="" title="" id="83" name="Picture"/>
+                  <wp:docPr descr="" title="" id="87" name="Picture"/>
                   <a:graphic>
                     <a:graphicData uri="http://schemas.openxmlformats.org/drawingml/2006/picture">
                       <pic:pic>
                         <pic:nvPicPr>
-                          <pic:cNvPr descr="/home/user/MAP---A/research/where-people-go-dengue/paper/eq/eq_19874ed6792eb5aa.png" id="84" name="Picture"/>
+                          <pic:cNvPr descr="/home/user/MAP---A/research/where-people-go-dengue/paper/eq/eq_19874ed6792eb5aa.png" id="88" name="Picture"/>
                           <pic:cNvPicPr>
                             <a:picLocks noChangeArrowheads="1" noChangeAspect="1"/>
                           </pic:cNvPicPr>
                         </pic:nvPicPr>
                         <pic:blipFill>
-                          <a:blip r:embed="rId82"/>
+                          <a:blip r:embed="rId86"/>
                           <a:stretch>
                             <a:fillRect/>
                           </a:stretch>
@@ -7440,8 +7597,8 @@
         <w:t xml:space="preserve"> 4  report the error bound of Proposition 11 when every p_ii &gt; 1/2</w:t>
       </w:r>
     </w:p>
-    <w:bookmarkEnd w:id="85"/>
-    <w:bookmarkStart w:id="89" w:name="the-outbreak-alarm"/>
+    <w:bookmarkEnd w:id="89"/>
+    <w:bookmarkStart w:id="93" w:name="the-outbreak-alarm"/>
     <w:p>
       <w:pPr>
         <w:pStyle w:val="Heading2"/>
@@ -7581,18 +7738,18 @@
                 <wp:inline>
                   <wp:extent cx="5050231" cy="323068"/>
                   <wp:effectExtent b="0" l="0" r="0" t="0"/>
-                  <wp:docPr descr="" title="" id="87" name="Picture"/>
+                  <wp:docPr descr="" title="" id="91" name="Picture"/>
                   <a:graphic>
                     <a:graphicData uri="http://schemas.openxmlformats.org/drawingml/2006/picture">
                       <pic:pic>
                         <pic:nvPicPr>
-                          <pic:cNvPr descr="/home/user/MAP---A/research/where-people-go-dengue/paper/eq/eq_bd66b463f53e35ed.png" id="88" name="Picture"/>
+                          <pic:cNvPr descr="/home/user/MAP---A/research/where-people-go-dengue/paper/eq/eq_bd66b463f53e35ed.png" id="92" name="Picture"/>
                           <pic:cNvPicPr>
                             <a:picLocks noChangeArrowheads="1" noChangeAspect="1"/>
                           </pic:cNvPicPr>
                         </pic:nvPicPr>
                         <pic:blipFill>
-                          <a:blip r:embed="rId86"/>
+                          <a:blip r:embed="rId90"/>
                           <a:stretch>
                             <a:fillRect/>
                           </a:stretch>
@@ -7867,8 +8024,8 @@
         <w:t xml:space="preserve">    under Poisson counts; ARL = ((I - Q)^-1 1) at state 0   (Brook &amp; Evans, 1972)</w:t>
       </w:r>
     </w:p>
-    <w:bookmarkEnd w:id="89"/>
-    <w:bookmarkStart w:id="90" w:name="seasons"/>
+    <w:bookmarkEnd w:id="93"/>
+    <w:bookmarkStart w:id="94" w:name="seasons"/>
     <w:p>
       <w:pPr>
         <w:pStyle w:val="Heading2"/>
@@ -7972,8 +8129,8 @@
         <w:t xml:space="preserve">= 1 is the reference season of the survey, and values above one describe the peak of the rainy season.</w:t>
       </w:r>
     </w:p>
-    <w:bookmarkEnd w:id="90"/>
-    <w:bookmarkStart w:id="91" w:name="strategies-compared"/>
+    <w:bookmarkEnd w:id="94"/>
+    <w:bookmarkStart w:id="95" w:name="strategies-compared"/>
     <w:p>
       <w:pPr>
         <w:pStyle w:val="Heading2"/>
@@ -8104,8 +8261,8 @@
         <w:t xml:space="preserve">solves program (9). The first three are scaled up until they reach the target.</w:t>
       </w:r>
     </w:p>
-    <w:bookmarkEnd w:id="91"/>
-    <w:bookmarkStart w:id="92" w:name="assumptions"/>
+    <w:bookmarkEnd w:id="95"/>
+    <w:bookmarkStart w:id="96" w:name="assumptions"/>
     <w:p>
       <w:pPr>
         <w:pStyle w:val="Heading2"/>
@@ -8118,7 +8275,7 @@
       <w:pPr>
         <w:numPr>
           <w:ilvl w:val="0"/>
-          <w:numId w:val="1004"/>
+          <w:numId w:val="1005"/>
         </w:numPr>
         <w:pStyle w:val="Compact"/>
       </w:pPr>
@@ -8177,7 +8334,7 @@
       <w:pPr>
         <w:numPr>
           <w:ilvl w:val="0"/>
-          <w:numId w:val="1004"/>
+          <w:numId w:val="1005"/>
         </w:numPr>
         <w:pStyle w:val="Compact"/>
       </w:pPr>
@@ -8199,7 +8356,7 @@
       <w:pPr>
         <w:numPr>
           <w:ilvl w:val="0"/>
-          <w:numId w:val="1004"/>
+          <w:numId w:val="1005"/>
         </w:numPr>
         <w:pStyle w:val="Compact"/>
       </w:pPr>
@@ -8245,7 +8402,7 @@
       <w:pPr>
         <w:numPr>
           <w:ilvl w:val="0"/>
-          <w:numId w:val="1004"/>
+          <w:numId w:val="1005"/>
         </w:numPr>
         <w:pStyle w:val="Compact"/>
       </w:pPr>
@@ -8309,7 +8466,7 @@
       <w:pPr>
         <w:numPr>
           <w:ilvl w:val="0"/>
-          <w:numId w:val="1004"/>
+          <w:numId w:val="1005"/>
         </w:numPr>
         <w:pStyle w:val="Compact"/>
       </w:pPr>
@@ -8331,7 +8488,7 @@
       <w:pPr>
         <w:numPr>
           <w:ilvl w:val="0"/>
-          <w:numId w:val="1004"/>
+          <w:numId w:val="1005"/>
         </w:numPr>
         <w:pStyle w:val="Compact"/>
       </w:pPr>
@@ -8349,8 +8506,8 @@
         <w:t xml:space="preserve">Each number reported here is a derivation, a declared parameter, a figure from a public report, or an output of a synthetic test instance. No surveillance record, survey sheet, or patient file was used.</w:t>
       </w:r>
     </w:p>
-    <w:bookmarkEnd w:id="92"/>
-    <w:bookmarkStart w:id="93" w:name="notation"/>
+    <w:bookmarkEnd w:id="96"/>
+    <w:bookmarkStart w:id="97" w:name="notation"/>
     <w:p>
       <w:pPr>
         <w:pStyle w:val="Heading2"/>
@@ -9486,9 +9643,9 @@
         </w:tc>
       </w:tr>
     </w:tbl>
-    <w:bookmarkEnd w:id="93"/>
-    <w:bookmarkEnd w:id="94"/>
-    <w:bookmarkStart w:id="143" w:name="findings"/>
+    <w:bookmarkEnd w:id="97"/>
+    <w:bookmarkEnd w:id="98"/>
+    <w:bookmarkStart w:id="147" w:name="findings"/>
     <w:p>
       <w:pPr>
         <w:pStyle w:val="Heading1"/>
@@ -9497,7 +9654,7 @@
         <w:t xml:space="preserve">3. FINDINGS</w:t>
       </w:r>
     </w:p>
-    <w:bookmarkStart w:id="95" w:name="data-and-integrity-of-the-results"/>
+    <w:bookmarkStart w:id="99" w:name="data-and-integrity-of-the-results"/>
     <w:p>
       <w:pPr>
         <w:pStyle w:val="Heading2"/>
@@ -9556,8 +9713,8 @@
         <w:t xml:space="preserve">(Appendix F). The six barangays of Section 3.5 are invented; none of their figures describes a real barangay, school, or market in Albay.</w:t>
       </w:r>
     </w:p>
-    <w:bookmarkEnd w:id="95"/>
-    <w:bookmarkStart w:id="96" w:name="general-methods"/>
+    <w:bookmarkEnd w:id="99"/>
+    <w:bookmarkStart w:id="100" w:name="general-methods"/>
     <w:p>
       <w:pPr>
         <w:pStyle w:val="Heading2"/>
@@ -9755,8 +9912,8 @@
         <w:t xml:space="preserve">Section 3.3 tests every proven property against an independent implementation on random synthetic instances, and Section 3.4 reports running times.</w:t>
       </w:r>
     </w:p>
-    <w:bookmarkEnd w:id="96"/>
-    <w:bookmarkStart w:id="121" w:name="theoretical-results"/>
+    <w:bookmarkEnd w:id="100"/>
+    <w:bookmarkStart w:id="125" w:name="theoretical-results"/>
     <w:p>
       <w:pPr>
         <w:pStyle w:val="Heading2"/>
@@ -9827,18 +9984,18 @@
                 <wp:inline>
                   <wp:extent cx="2322576" cy="344423"/>
                   <wp:effectExtent b="0" l="0" r="0" t="0"/>
-                  <wp:docPr descr="" title="" id="98" name="Picture"/>
+                  <wp:docPr descr="" title="" id="102" name="Picture"/>
                   <a:graphic>
                     <a:graphicData uri="http://schemas.openxmlformats.org/drawingml/2006/picture">
                       <pic:pic>
                         <pic:nvPicPr>
-                          <pic:cNvPr descr="/home/user/MAP---A/research/where-people-go-dengue/paper/eq/eq_36ea0e9bc5780085.png" id="99" name="Picture"/>
+                          <pic:cNvPr descr="/home/user/MAP---A/research/where-people-go-dengue/paper/eq/eq_36ea0e9bc5780085.png" id="103" name="Picture"/>
                           <pic:cNvPicPr>
                             <a:picLocks noChangeArrowheads="1" noChangeAspect="1"/>
                           </pic:cNvPicPr>
                         </pic:nvPicPr>
                         <pic:blipFill>
-                          <a:blip r:embed="rId97"/>
+                          <a:blip r:embed="rId101"/>
                           <a:stretch>
                             <a:fillRect/>
                           </a:stretch>
@@ -10734,18 +10891,18 @@
                 <wp:inline>
                   <wp:extent cx="4629607" cy="393166"/>
                   <wp:effectExtent b="0" l="0" r="0" t="0"/>
-                  <wp:docPr descr="" title="" id="101" name="Picture"/>
+                  <wp:docPr descr="" title="" id="105" name="Picture"/>
                   <a:graphic>
                     <a:graphicData uri="http://schemas.openxmlformats.org/drawingml/2006/picture">
                       <pic:pic>
                         <pic:nvPicPr>
-                          <pic:cNvPr descr="/home/user/MAP---A/research/where-people-go-dengue/paper/eq/eq_69d093e250dde31c.png" id="102" name="Picture"/>
+                          <pic:cNvPr descr="/home/user/MAP---A/research/where-people-go-dengue/paper/eq/eq_69d093e250dde31c.png" id="106" name="Picture"/>
                           <pic:cNvPicPr>
                             <a:picLocks noChangeArrowheads="1" noChangeAspect="1"/>
                           </pic:cNvPicPr>
                         </pic:nvPicPr>
                         <pic:blipFill>
-                          <a:blip r:embed="rId100"/>
+                          <a:blip r:embed="rId104"/>
                           <a:stretch>
                             <a:fillRect/>
                           </a:stretch>
@@ -12000,18 +12157,18 @@
                 <wp:inline>
                   <wp:extent cx="1566367" cy="237697"/>
                   <wp:effectExtent b="0" l="0" r="0" t="0"/>
-                  <wp:docPr descr="" title="" id="104" name="Picture"/>
+                  <wp:docPr descr="" title="" id="108" name="Picture"/>
                   <a:graphic>
                     <a:graphicData uri="http://schemas.openxmlformats.org/drawingml/2006/picture">
                       <pic:pic>
                         <pic:nvPicPr>
-                          <pic:cNvPr descr="/home/user/MAP---A/research/where-people-go-dengue/paper/eq/eq_674f2458640226cf.png" id="105" name="Picture"/>
+                          <pic:cNvPr descr="/home/user/MAP---A/research/where-people-go-dengue/paper/eq/eq_674f2458640226cf.png" id="109" name="Picture"/>
                           <pic:cNvPicPr>
                             <a:picLocks noChangeArrowheads="1" noChangeAspect="1"/>
                           </pic:cNvPicPr>
                         </pic:nvPicPr>
                         <pic:blipFill>
-                          <a:blip r:embed="rId103"/>
+                          <a:blip r:embed="rId107"/>
                           <a:stretch>
                             <a:fillRect/>
                           </a:stretch>
@@ -12744,18 +12901,18 @@
                 <wp:inline>
                   <wp:extent cx="697687" cy="307713"/>
                   <wp:effectExtent b="0" l="0" r="0" t="0"/>
-                  <wp:docPr descr="" title="" id="107" name="Picture"/>
+                  <wp:docPr descr="" title="" id="111" name="Picture"/>
                   <a:graphic>
                     <a:graphicData uri="http://schemas.openxmlformats.org/drawingml/2006/picture">
                       <pic:pic>
                         <pic:nvPicPr>
-                          <pic:cNvPr descr="/home/user/MAP---A/research/where-people-go-dengue/paper/eq/eq_dd64e73a2d7a86c8.png" id="108" name="Picture"/>
+                          <pic:cNvPr descr="/home/user/MAP---A/research/where-people-go-dengue/paper/eq/eq_dd64e73a2d7a86c8.png" id="112" name="Picture"/>
                           <pic:cNvPicPr>
                             <a:picLocks noChangeArrowheads="1" noChangeAspect="1"/>
                           </pic:cNvPicPr>
                         </pic:nvPicPr>
                         <pic:blipFill>
-                          <a:blip r:embed="rId106"/>
+                          <a:blip r:embed="rId110"/>
                           <a:stretch>
                             <a:fillRect/>
                           </a:stretch>
@@ -13214,18 +13371,18 @@
                 <wp:inline>
                   <wp:extent cx="1874520" cy="390144"/>
                   <wp:effectExtent b="0" l="0" r="0" t="0"/>
-                  <wp:docPr descr="" title="" id="110" name="Picture"/>
+                  <wp:docPr descr="" title="" id="114" name="Picture"/>
                   <a:graphic>
                     <a:graphicData uri="http://schemas.openxmlformats.org/drawingml/2006/picture">
                       <pic:pic>
                         <pic:nvPicPr>
-                          <pic:cNvPr descr="/home/user/MAP---A/research/where-people-go-dengue/paper/eq/eq_c1e5877bfe28540a.png" id="111" name="Picture"/>
+                          <pic:cNvPr descr="/home/user/MAP---A/research/where-people-go-dengue/paper/eq/eq_c1e5877bfe28540a.png" id="115" name="Picture"/>
                           <pic:cNvPicPr>
                             <a:picLocks noChangeArrowheads="1" noChangeAspect="1"/>
                           </pic:cNvPicPr>
                         </pic:nvPicPr>
                         <pic:blipFill>
-                          <a:blip r:embed="rId109"/>
+                          <a:blip r:embed="rId113"/>
                           <a:stretch>
                             <a:fillRect/>
                           </a:stretch>
@@ -14805,18 +14962,18 @@
                 <wp:inline>
                   <wp:extent cx="3642055" cy="320013"/>
                   <wp:effectExtent b="0" l="0" r="0" t="0"/>
-                  <wp:docPr descr="" title="" id="113" name="Picture"/>
+                  <wp:docPr descr="" title="" id="117" name="Picture"/>
                   <a:graphic>
                     <a:graphicData uri="http://schemas.openxmlformats.org/drawingml/2006/picture">
                       <pic:pic>
                         <pic:nvPicPr>
-                          <pic:cNvPr descr="/home/user/MAP---A/research/where-people-go-dengue/paper/eq/eq_ac551abc1fde1c7e.png" id="114" name="Picture"/>
+                          <pic:cNvPr descr="/home/user/MAP---A/research/where-people-go-dengue/paper/eq/eq_ac551abc1fde1c7e.png" id="118" name="Picture"/>
                           <pic:cNvPicPr>
                             <a:picLocks noChangeArrowheads="1" noChangeAspect="1"/>
                           </pic:cNvPicPr>
                         </pic:nvPicPr>
                         <pic:blipFill>
-                          <a:blip r:embed="rId112"/>
+                          <a:blip r:embed="rId116"/>
                           <a:stretch>
                             <a:fillRect/>
                           </a:stretch>
@@ -16007,18 +16164,18 @@
                 <wp:inline>
                   <wp:extent cx="1645920" cy="359663"/>
                   <wp:effectExtent b="0" l="0" r="0" t="0"/>
-                  <wp:docPr descr="" title="" id="116" name="Picture"/>
+                  <wp:docPr descr="" title="" id="120" name="Picture"/>
                   <a:graphic>
                     <a:graphicData uri="http://schemas.openxmlformats.org/drawingml/2006/picture">
                       <pic:pic>
                         <pic:nvPicPr>
-                          <pic:cNvPr descr="/home/user/MAP---A/research/where-people-go-dengue/paper/eq/eq_9b42c12daa696511.png" id="117" name="Picture"/>
+                          <pic:cNvPr descr="/home/user/MAP---A/research/where-people-go-dengue/paper/eq/eq_9b42c12daa696511.png" id="121" name="Picture"/>
                           <pic:cNvPicPr>
                             <a:picLocks noChangeArrowheads="1" noChangeAspect="1"/>
                           </pic:cNvPicPr>
                         </pic:nvPicPr>
                         <pic:blipFill>
-                          <a:blip r:embed="rId115"/>
+                          <a:blip r:embed="rId119"/>
                           <a:stretch>
                             <a:fillRect/>
                           </a:stretch>
@@ -16578,18 +16735,18 @@
                 <wp:inline>
                   <wp:extent cx="832104" cy="152400"/>
                   <wp:effectExtent b="0" l="0" r="0" t="0"/>
-                  <wp:docPr descr="" title="" id="119" name="Picture"/>
+                  <wp:docPr descr="" title="" id="123" name="Picture"/>
                   <a:graphic>
                     <a:graphicData uri="http://schemas.openxmlformats.org/drawingml/2006/picture">
                       <pic:pic>
                         <pic:nvPicPr>
-                          <pic:cNvPr descr="/home/user/MAP---A/research/where-people-go-dengue/paper/eq/eq_11ffa41692e45313.png" id="120" name="Picture"/>
+                          <pic:cNvPr descr="/home/user/MAP---A/research/where-people-go-dengue/paper/eq/eq_11ffa41692e45313.png" id="124" name="Picture"/>
                           <pic:cNvPicPr>
                             <a:picLocks noChangeArrowheads="1" noChangeAspect="1"/>
                           </pic:cNvPicPr>
                         </pic:nvPicPr>
                         <pic:blipFill>
-                          <a:blip r:embed="rId118"/>
+                          <a:blip r:embed="rId122"/>
                           <a:stretch>
                             <a:fillRect/>
                           </a:stretch>
@@ -16645,7 +16802,7 @@
       <w:pPr>
         <w:numPr>
           <w:ilvl w:val="0"/>
-          <w:numId w:val="1005"/>
+          <w:numId w:val="1006"/>
         </w:numPr>
         <w:pStyle w:val="Compact"/>
       </w:pPr>
@@ -17358,8 +17515,8 @@
         <w:t xml:space="preserve">= 12.75 and weekly counts at least two above the reference value, the alarm needs at most 7 weeks. Part (iii) prices the promise in false alarms before any season begins.</w:t>
       </w:r>
     </w:p>
-    <w:bookmarkEnd w:id="121"/>
-    <w:bookmarkStart w:id="122" w:name="software-verification"/>
+    <w:bookmarkEnd w:id="125"/>
+    <w:bookmarkStart w:id="126" w:name="software-verification"/>
     <w:p>
       <w:pPr>
         <w:pStyle w:val="Heading2"/>
@@ -18030,8 +18187,8 @@
         <w:t xml:space="preserve">The least-cost row deserves a comment. The general solver started from twelve points and returned plans no cheaper than the certified upper bound; in the two-barangay cases the grid, which cannot miss the region of the optimum, found no plan below the certified lower bound. The certificate row shows the price of speed: a quick linear program that is always safe but costs on average 14.5 percent more.</w:t>
       </w:r>
     </w:p>
-    <w:bookmarkEnd w:id="122"/>
-    <w:bookmarkStart w:id="123" w:name="computational-cost"/>
+    <w:bookmarkEnd w:id="126"/>
+    <w:bookmarkStart w:id="127" w:name="computational-cost"/>
     <w:p>
       <w:pPr>
         <w:pStyle w:val="Heading2"/>
@@ -18726,8 +18883,8 @@
         <w:t xml:space="preserve">The reproduction number and the shares for all 720 barangays of Albay take a fraction of a second. The exact least-cost plan for the whole province, with its certificate of optimality, takes about a minute; the safe certificate plan takes about one second.</w:t>
       </w:r>
     </w:p>
-    <w:bookmarkEnd w:id="123"/>
-    <w:bookmarkStart w:id="137" w:name="worked-instance-d1"/>
+    <w:bookmarkEnd w:id="127"/>
+    <w:bookmarkStart w:id="141" w:name="worked-instance-d1"/>
     <w:p>
       <w:pPr>
         <w:pStyle w:val="Heading2"/>
@@ -19534,18 +19691,18 @@
           <wp:inline>
             <wp:extent cx="4937760" cy="3549015"/>
             <wp:effectExtent b="0" l="0" r="0" t="0"/>
-            <wp:docPr descr="" title="" id="125" name="Picture"/>
+            <wp:docPr descr="" title="" id="129" name="Picture"/>
             <a:graphic>
               <a:graphicData uri="http://schemas.openxmlformats.org/drawingml/2006/picture">
                 <pic:pic>
                   <pic:nvPicPr>
-                    <pic:cNvPr descr="/home/user/MAP---A/research/where-people-go-dengue/paper/../code/figures/fig_d1_network.png" id="126" name="Picture"/>
+                    <pic:cNvPr descr="/home/user/MAP---A/research/where-people-go-dengue/paper/../code/figures/fig_d1_network.png" id="130" name="Picture"/>
                     <pic:cNvPicPr>
                       <a:picLocks noChangeArrowheads="1" noChangeAspect="1"/>
                     </pic:cNvPicPr>
                   </pic:nvPicPr>
                   <pic:blipFill>
-                    <a:blip r:embed="rId124"/>
+                    <a:blip r:embed="rId128"/>
                     <a:stretch>
                       <a:fillRect/>
                     </a:stretch>
@@ -20299,7 +20456,7 @@
         </w:tc>
       </w:tr>
     </w:tbl>
-    <w:bookmarkStart w:id="130" w:name="Xe0ea827a3cfa98dd1d0b8cf264d8f849b504703"/>
+    <w:bookmarkStart w:id="134" w:name="Xe0ea827a3cfa98dd1d0b8cf264d8f849b504703"/>
     <w:p>
       <w:pPr>
         <w:pStyle w:val="Heading3"/>
@@ -21199,18 +21356,18 @@
           <wp:inline>
             <wp:extent cx="5120640" cy="2720340"/>
             <wp:effectExtent b="0" l="0" r="0" t="0"/>
-            <wp:docPr descr="" title="" id="128" name="Picture"/>
+            <wp:docPr descr="" title="" id="132" name="Picture"/>
             <a:graphic>
               <a:graphicData uri="http://schemas.openxmlformats.org/drawingml/2006/picture">
                 <pic:pic>
                   <pic:nvPicPr>
-                    <pic:cNvPr descr="/home/user/MAP---A/research/where-people-go-dengue/paper/../code/figures/fig_d1_shares.png" id="129" name="Picture"/>
+                    <pic:cNvPr descr="/home/user/MAP---A/research/where-people-go-dengue/paper/../code/figures/fig_d1_shares.png" id="133" name="Picture"/>
                     <pic:cNvPicPr>
                       <a:picLocks noChangeArrowheads="1" noChangeAspect="1"/>
                     </pic:cNvPicPr>
                   </pic:nvPicPr>
                   <pic:blipFill>
-                    <a:blip r:embed="rId127"/>
+                    <a:blip r:embed="rId131"/>
                     <a:stretch>
                       <a:fillRect/>
                     </a:stretch>
@@ -21285,8 +21442,8 @@
         <w:t xml:space="preserve">= 1.759 on its own, the highest of all, because its mosquitoes would bite only its own residents. Movement dilutes those bites over more people by day, which brings the whole network to 1.214, but it also carries the infection to every barangay whose residents visit B1.</w:t>
       </w:r>
     </w:p>
-    <w:bookmarkEnd w:id="130"/>
-    <w:bookmarkStart w:id="131" w:name="vector-control-at-least-cost-1"/>
+    <w:bookmarkEnd w:id="134"/>
+    <w:bookmarkStart w:id="135" w:name="vector-control-at-least-cost-1"/>
     <w:p>
       <w:pPr>
         <w:pStyle w:val="Heading3"/>
@@ -22475,8 +22632,8 @@
         <w:t xml:space="preserve">Table 13 applies Proposition 10. Below a season factor of 0.68, dengue cannot take hold in D1 at all. Each rise of 0.2 in the factor adds roughly ten to twelve team-days to the bill, which tells a provincial health office how much brigade time to set aside before the rains.</w:t>
       </w:r>
     </w:p>
-    <w:bookmarkEnd w:id="131"/>
-    <w:bookmarkStart w:id="132" w:name="where-people-got-infected"/>
+    <w:bookmarkEnd w:id="135"/>
+    <w:bookmarkStart w:id="136" w:name="where-people-got-infected"/>
     <w:p>
       <w:pPr>
         <w:pStyle w:val="Heading3"/>
@@ -22930,8 +23087,8 @@
         <w:t xml:space="preserve">The residence column again points to B2. The inferred column points to B1 and comes close to the true distribution, which is unknown in practice but known here because the data are synthetic. By Proposition 11 the error of the exact inverse is at most 5 times the error of the reported rates.</w:t>
       </w:r>
     </w:p>
-    <w:bookmarkEnd w:id="132"/>
-    <w:bookmarkStart w:id="136" w:name="early-warning"/>
+    <w:bookmarkEnd w:id="136"/>
+    <w:bookmarkStart w:id="140" w:name="early-warning"/>
     <w:p>
       <w:pPr>
         <w:pStyle w:val="Heading3"/>
@@ -22989,18 +23146,18 @@
           <wp:inline>
             <wp:extent cx="5120640" cy="3840480"/>
             <wp:effectExtent b="0" l="0" r="0" t="0"/>
-            <wp:docPr descr="" title="" id="134" name="Picture"/>
+            <wp:docPr descr="" title="" id="138" name="Picture"/>
             <a:graphic>
               <a:graphicData uri="http://schemas.openxmlformats.org/drawingml/2006/picture">
                 <pic:pic>
                   <pic:nvPicPr>
-                    <pic:cNvPr descr="/home/user/MAP---A/research/where-people-go-dengue/paper/../code/figures/fig_cusum.png" id="135" name="Picture"/>
+                    <pic:cNvPr descr="/home/user/MAP---A/research/where-people-go-dengue/paper/../code/figures/fig_cusum.png" id="139" name="Picture"/>
                     <pic:cNvPicPr>
                       <a:picLocks noChangeArrowheads="1" noChangeAspect="1"/>
                     </pic:cNvPicPr>
                   </pic:nvPicPr>
                   <pic:blipFill>
-                    <a:blip r:embed="rId133"/>
+                    <a:blip r:embed="rId137"/>
                     <a:stretch>
                       <a:fillRect/>
                     </a:stretch>
@@ -23884,9 +24041,9 @@
         <w:t xml:space="preserve">= 10. One week seldom looks unusual on its own, but a run of weeks a little above normal accumulates.</w:t>
       </w:r>
     </w:p>
-    <w:bookmarkEnd w:id="136"/>
-    <w:bookmarkEnd w:id="137"/>
-    <w:bookmarkStart w:id="142" w:name="X9c22aa522b1006db809714ab9a9a758775e2e55"/>
+    <w:bookmarkEnd w:id="140"/>
+    <w:bookmarkEnd w:id="141"/>
+    <w:bookmarkStart w:id="146" w:name="X9c22aa522b1006db809714ab9a9a758775e2e55"/>
     <w:p>
       <w:pPr>
         <w:pStyle w:val="Heading2"/>
@@ -23903,7 +24060,7 @@
         <w:t xml:space="preserve">The next run of the model covers all 720 barangays of Albay, using the travel times of the companion study, attractions from the school and market registers, and mosquito indices from provincial surveys. The tests and decision rules that follow were set down before any result for that instance existed.</w:t>
       </w:r>
     </w:p>
-    <w:bookmarkStart w:id="138" w:name="sensitivity-analysis"/>
+    <w:bookmarkStart w:id="142" w:name="sensitivity-analysis"/>
     <w:p>
       <w:pPr>
         <w:pStyle w:val="Heading3"/>
@@ -23965,8 +24122,8 @@
         <w:t xml:space="preserve">= 1.3, 1.5, 2.0).</w:t>
       </w:r>
     </w:p>
-    <w:bookmarkEnd w:id="138"/>
-    <w:bookmarkStart w:id="139" w:name="statistical-treatment"/>
+    <w:bookmarkEnd w:id="142"/>
+    <w:bookmarkStart w:id="143" w:name="statistical-treatment"/>
     <w:p>
       <w:pPr>
         <w:pStyle w:val="Heading3"/>
@@ -24275,610 +24432,14 @@
         </w:tc>
       </w:tr>
     </w:tbl>
-    <w:bookmarkEnd w:id="139"/>
-    <w:bookmarkStart w:id="140" w:name="hypotheses-fixed-in-advance"/>
+    <w:bookmarkEnd w:id="143"/>
+    <w:bookmarkStart w:id="144" w:name="hypotheses-fixed-in-advance"/>
     <w:p>
       <w:pPr>
         <w:pStyle w:val="Heading3"/>
       </w:pPr>
       <w:r>
         <w:t xml:space="preserve">3.6.3 Hypotheses Fixed in Advance</w:t>
-      </w:r>
-    </w:p>
-    <w:p>
-      <w:pPr>
-        <w:numPr>
-          <w:ilvl w:val="0"/>
-          <w:numId w:val="1006"/>
-        </w:numPr>
-        <w:pStyle w:val="Compact"/>
-      </w:pPr>
-      <w:r>
-        <w:rPr>
-          <w:bCs/>
-          <w:b/>
-        </w:rPr>
-        <w:t xml:space="preserve">H1.</w:t>
-      </w:r>
-      <w:r>
-        <w:t xml:space="preserve"> </w:t>
-      </w:r>
-      <w:r>
-        <w:t xml:space="preserve">Albay’s network reproduction number is at least 10 percent higher than its provincial-average value; this holds if the whole bootstrap interval of the ratio sits above 1.10.</w:t>
-      </w:r>
-    </w:p>
-    <w:p>
-      <w:pPr>
-        <w:numPr>
-          <w:ilvl w:val="0"/>
-          <w:numId w:val="1006"/>
-        </w:numPr>
-        <w:pStyle w:val="Compact"/>
-      </w:pPr>
-      <w:r>
-        <w:rPr>
-          <w:bCs/>
-          <w:b/>
-        </w:rPr>
-        <w:t xml:space="preserve">H2.</w:t>
-      </w:r>
-      <w:r>
-        <w:t xml:space="preserve"> </w:t>
-      </w:r>
-      <w:r>
-        <w:t xml:space="preserve">In more than half of the municipalities with ten or more barangays, the barangay with the largest share of transmission hosts a central school or a public market.</w:t>
-      </w:r>
-    </w:p>
-    <w:p>
-      <w:pPr>
-        <w:numPr>
-          <w:ilvl w:val="0"/>
-          <w:numId w:val="1006"/>
-        </w:numPr>
-        <w:pStyle w:val="Compact"/>
-      </w:pPr>
-      <w:r>
-        <w:rPr>
-          <w:bCs/>
-          <w:b/>
-        </w:rPr>
-        <w:t xml:space="preserve">H3.</w:t>
-      </w:r>
-      <w:r>
-        <w:t xml:space="preserve"> </w:t>
-      </w:r>
-      <w:r>
-        <w:t xml:space="preserve">In at least half of the municipalities, the barangay with the most reported cases is not the barangay with the most inferred infections.</w:t>
-      </w:r>
-    </w:p>
-    <w:p>
-      <w:pPr>
-        <w:numPr>
-          <w:ilvl w:val="0"/>
-          <w:numId w:val="1006"/>
-        </w:numPr>
-        <w:pStyle w:val="Compact"/>
-      </w:pPr>
-      <w:r>
-        <w:rPr>
-          <w:bCs/>
-          <w:b/>
-        </w:rPr>
-        <w:t xml:space="preserve">H4.</w:t>
-      </w:r>
-      <w:r>
-        <w:t xml:space="preserve"> </w:t>
-      </w:r>
-      <w:r>
-        <w:t xml:space="preserve">The least-cost plan costs at least 25 percent less than uniform control at the same target in a majority of municipalities.</w:t>
-      </w:r>
-    </w:p>
-    <w:p>
-      <w:pPr>
-        <w:numPr>
-          <w:ilvl w:val="0"/>
-          <w:numId w:val="1006"/>
-        </w:numPr>
-        <w:pStyle w:val="Compact"/>
-      </w:pPr>
-      <w:r>
-        <w:rPr>
-          <w:bCs/>
-          <w:b/>
-        </w:rPr>
-        <w:t xml:space="preserve">H5.</w:t>
-      </w:r>
-      <w:r>
-        <w:t xml:space="preserve"> </w:t>
-      </w:r>
-      <w:r>
-        <w:t xml:space="preserve">The certificate plan costs at most 30 percent more than the least-cost plan, so that it can serve as a quick, safe plan during a surge.</w:t>
-      </w:r>
-    </w:p>
-    <w:p>
-      <w:pPr>
-        <w:numPr>
-          <w:ilvl w:val="0"/>
-          <w:numId w:val="1006"/>
-        </w:numPr>
-        <w:pStyle w:val="Compact"/>
-      </w:pPr>
-      <w:r>
-        <w:rPr>
-          <w:bCs/>
-          <w:b/>
-        </w:rPr>
-        <w:t xml:space="preserve">H6.</w:t>
-      </w:r>
-      <w:r>
-        <w:t xml:space="preserve"> </w:t>
-      </w:r>
-      <w:r>
-        <w:t xml:space="preserve">Retrospectively on 2026 data, the CUSUM alarm sounds earlier than the single-week rule in at least 12 of the 18 municipalities.</w:t>
-      </w:r>
-    </w:p>
-    <w:p>
-      <w:pPr>
-        <w:numPr>
-          <w:ilvl w:val="0"/>
-          <w:numId w:val="1006"/>
-        </w:numPr>
-        <w:pStyle w:val="Compact"/>
-      </w:pPr>
-      <w:r>
-        <w:rPr>
-          <w:bCs/>
-          <w:b/>
-        </w:rPr>
-        <w:t xml:space="preserve">H7.</w:t>
-      </w:r>
-      <w:r>
-        <w:t xml:space="preserve"> </w:t>
-      </w:r>
-      <w:r>
-        <w:t xml:space="preserve">The ranking of places by share is stable across the sweeps (Spearman’s</w:t>
-      </w:r>
-      <w:r>
-        <w:t xml:space="preserve"> </w:t>
-      </w:r>
-      <w:r>
-        <w:rPr>
-          <w:iCs/>
-          <w:i/>
-        </w:rPr>
-        <w:t xml:space="preserve">ρ</w:t>
-      </w:r>
-      <w:r>
-        <w:t xml:space="preserve"> </w:t>
-      </w:r>
-      <w:r>
-        <w:t xml:space="preserve">above 0.8).</w:t>
-      </w:r>
-    </w:p>
-    <w:p>
-      <w:pPr>
-        <w:numPr>
-          <w:ilvl w:val="0"/>
-          <w:numId w:val="1006"/>
-        </w:numPr>
-        <w:pStyle w:val="Compact"/>
-      </w:pPr>
-      <w:r>
-        <w:rPr>
-          <w:bCs/>
-          <w:b/>
-        </w:rPr>
-        <w:t xml:space="preserve">H8.</w:t>
-      </w:r>
-      <w:r>
-        <w:t xml:space="preserve"> </w:t>
-      </w:r>
-      <w:r>
-        <w:t xml:space="preserve">Propositions 7 and 10 make monotonicity exact; any computed violation will be treated as a data error and the inputs checked.</w:t>
-      </w:r>
-    </w:p>
-    <w:bookmarkEnd w:id="140"/>
-    <w:bookmarkStart w:id="141" w:name="sensitivity-sweeps"/>
-    <w:p>
-      <w:pPr>
-        <w:pStyle w:val="Heading3"/>
-      </w:pPr>
-      <w:r>
-        <w:t xml:space="preserve">3.6.4 Sensitivity Sweeps</w:t>
-      </w:r>
-    </w:p>
-    <w:p>
-      <w:pPr>
-        <w:pStyle w:val="FirstParagraph"/>
-      </w:pPr>
-      <w:r>
-        <w:t xml:space="preserve">Each sweep of Section 3.6.1 recomputes the reproduction number, the place shares, the five strategies, and the alarm weeks. The results will be reported with the hypotheses above.</w:t>
-      </w:r>
-    </w:p>
-    <w:bookmarkEnd w:id="141"/>
-    <w:bookmarkEnd w:id="142"/>
-    <w:bookmarkEnd w:id="143"/>
-    <w:bookmarkStart w:id="148" w:name="conclusions"/>
-    <w:p>
-      <w:pPr>
-        <w:pStyle w:val="Heading1"/>
-      </w:pPr>
-      <w:r>
-        <w:t xml:space="preserve">4. CONCLUSIONS</w:t>
-      </w:r>
-    </w:p>
-    <w:bookmarkStart w:id="144" w:name="summary-of-the-findings"/>
-    <w:p>
-      <w:pPr>
-        <w:pStyle w:val="Heading2"/>
-      </w:pPr>
-      <w:r>
-        <w:t xml:space="preserve">4.1 Summary of the Findings</w:t>
-      </w:r>
-    </w:p>
-    <w:p>
-      <w:pPr>
-        <w:pStyle w:val="FirstParagraph"/>
-      </w:pPr>
-      <w:r>
-        <w:t xml:space="preserve">The central question was whether a health office could see where dengue is transmitted, decide how much control is enough and where to put it, and know when an outbreak has begun, using only open data and a laptop. The answer is yes for the mathematics: each of these tasks became a precise problem with a proven solution, and each proof survived a check against code written separately from the model. Whether the answer is also yes for Albay depends on the field data that the open-data instance will supply.</w:t>
-      </w:r>
-    </w:p>
-    <w:p>
-      <w:pPr>
-        <w:pStyle w:val="BodyText"/>
-      </w:pPr>
-      <w:r>
-        <w:rPr>
-          <w:bCs/>
-          <w:b/>
-        </w:rPr>
-        <w:t xml:space="preserve">Objective 1: the residence-time network.</w:t>
-      </w:r>
-      <w:r>
-        <w:t xml:space="preserve"> </w:t>
-      </w:r>
-      <w:r>
-        <w:t xml:space="preserve">Definitions 1 to 4 turned barangay populations, travel times, the pull of schools, markets, and workplaces, and mosquito indices into a matrix</w:t>
-      </w:r>
-      <w:r>
-        <w:t xml:space="preserve"> </w:t>
-      </w:r>
-      <w:r>
-        <w:rPr>
-          <w:iCs/>
-          <w:i/>
-        </w:rPr>
-        <w:t xml:space="preserve">P</w:t>
-      </w:r>
-      <w:r>
-        <w:t xml:space="preserve"> </w:t>
-      </w:r>
-      <w:r>
-        <w:t xml:space="preserve">of biting hours. Every row of</w:t>
-      </w:r>
-      <w:r>
-        <w:t xml:space="preserve"> </w:t>
-      </w:r>
-      <w:r>
-        <w:rPr>
-          <w:iCs/>
-          <w:i/>
-        </w:rPr>
-        <w:t xml:space="preserve">P</w:t>
-      </w:r>
-      <w:r>
-        <w:t xml:space="preserve"> </w:t>
-      </w:r>
-      <w:r>
-        <w:t xml:space="preserve">sums to one, and every entry has a public source or a declared value.</w:t>
-      </w:r>
-    </w:p>
-    <w:p>
-      <w:pPr>
-        <w:pStyle w:val="BodyText"/>
-      </w:pPr>
-      <w:r>
-        <w:rPr>
-          <w:bCs/>
-          <w:b/>
-        </w:rPr>
-        <w:t xml:space="preserve">Objective 2: the reproduction number and its bounds.</w:t>
-      </w:r>
-      <w:r>
-        <w:t xml:space="preserve"> </w:t>
-      </w:r>
-      <w:r>
-        <w:t xml:space="preserve">Proposition 1 wrote</w:t>
-      </w:r>
-      <w:r>
-        <w:t xml:space="preserve"> </w:t>
-      </w:r>
-      <w:r>
-        <w:rPr>
-          <w:iCs/>
-          <w:i/>
-        </w:rPr>
-        <w:t xml:space="preserve">R</w:t>
-      </w:r>
-      <w:r>
-        <w:rPr>
-          <w:vertAlign w:val="subscript"/>
-        </w:rPr>
-        <w:t xml:space="preserve">0</w:t>
-      </w:r>
-      <w:r>
-        <w:rPr>
-          <w:vertAlign w:val="superscript"/>
-        </w:rPr>
-        <w:t xml:space="preserve">2</w:t>
-      </w:r>
-      <w:r>
-        <w:t xml:space="preserve"> </w:t>
-      </w:r>
-      <w:r>
-        <w:t xml:space="preserve">as the largest eigenvalue of a symmetric positive semidefinite matrix, and Proposition 2 tied its threshold to the growth of infection. The formula matched a numerical next-generation matrix to within 5.3 × 10</w:t>
-      </w:r>
-      <w:r>
-        <w:rPr>
-          <w:vertAlign w:val="superscript"/>
-        </w:rPr>
-        <w:t xml:space="preserve">−15</w:t>
-      </w:r>
-      <w:r>
-        <w:t xml:space="preserve"> </w:t>
-      </w:r>
-      <w:r>
-        <w:t xml:space="preserve">in 300 random networks. Propositions 4 and 5 then trapped</w:t>
-      </w:r>
-      <w:r>
-        <w:t xml:space="preserve"> </w:t>
-      </w:r>
-      <w:r>
-        <w:rPr>
-          <w:iCs/>
-          <w:i/>
-        </w:rPr>
-        <w:t xml:space="preserve">R</w:t>
-      </w:r>
-      <w:r>
-        <w:rPr>
-          <w:vertAlign w:val="subscript"/>
-        </w:rPr>
-        <w:t xml:space="preserve">0</w:t>
-      </w:r>
-      <w:r>
-        <w:rPr>
-          <w:vertAlign w:val="superscript"/>
-        </w:rPr>
-        <w:t xml:space="preserve">2</w:t>
-      </w:r>
-      <w:r>
-        <w:t xml:space="preserve"> </w:t>
-      </w:r>
-      <w:r>
-        <w:t xml:space="preserve">between the smallest and largest local exposure numbers and showed that the provincial average can only understate it; no violation appeared in 500 instances.</w:t>
-      </w:r>
-    </w:p>
-    <w:p>
-      <w:pPr>
-        <w:pStyle w:val="BodyText"/>
-      </w:pPr>
-      <w:r>
-        <w:rPr>
-          <w:bCs/>
-          <w:b/>
-        </w:rPr>
-        <w:t xml:space="preserve">Objective 3: ranking places.</w:t>
-      </w:r>
-      <w:r>
-        <w:t xml:space="preserve"> </w:t>
-      </w:r>
-      <w:r>
-        <w:t xml:space="preserve">Proposition 6 split</w:t>
-      </w:r>
-      <w:r>
-        <w:t xml:space="preserve"> </w:t>
-      </w:r>
-      <w:r>
-        <w:rPr>
-          <w:iCs/>
-          <w:i/>
-        </w:rPr>
-        <w:t xml:space="preserve">R</w:t>
-      </w:r>
-      <w:r>
-        <w:rPr>
-          <w:vertAlign w:val="subscript"/>
-        </w:rPr>
-        <w:t xml:space="preserve">0</w:t>
-      </w:r>
-      <w:r>
-        <w:rPr>
-          <w:vertAlign w:val="superscript"/>
-        </w:rPr>
-        <w:t xml:space="preserve">2</w:t>
-      </w:r>
-      <w:r>
-        <w:t xml:space="preserve"> </w:t>
-      </w:r>
-      <w:r>
-        <w:t xml:space="preserve">into place shares that add to one and showed that each share is, up to a known factor, the rate at which control at that place lowers</w:t>
-      </w:r>
-      <w:r>
-        <w:t xml:space="preserve"> </w:t>
-      </w:r>
-      <w:r>
-        <w:rPr>
-          <w:iCs/>
-          <w:i/>
-        </w:rPr>
-        <w:t xml:space="preserve">R</w:t>
-      </w:r>
-      <w:r>
-        <w:rPr>
-          <w:vertAlign w:val="subscript"/>
-        </w:rPr>
-        <w:t xml:space="preserve">0</w:t>
-      </w:r>
-      <w:r>
-        <w:rPr>
-          <w:vertAlign w:val="superscript"/>
-        </w:rPr>
-        <w:t xml:space="preserve">2</w:t>
-      </w:r>
-      <w:r>
-        <w:t xml:space="preserve">. Shares and gradients agreed with finite differences in all 300 checks.</w:t>
-      </w:r>
-    </w:p>
-    <w:p>
-      <w:pPr>
-        <w:pStyle w:val="BodyText"/>
-      </w:pPr>
-      <w:r>
-        <w:rPr>
-          <w:bCs/>
-          <w:b/>
-        </w:rPr>
-        <w:t xml:space="preserve">Objective 4: least-cost control.</w:t>
-      </w:r>
-      <w:r>
-        <w:t xml:space="preserve"> </w:t>
-      </w:r>
-      <w:r>
-        <w:t xml:space="preserve">Because</w:t>
-      </w:r>
-      <w:r>
-        <w:t xml:space="preserve"> </w:t>
-      </w:r>
-      <w:r>
-        <w:rPr>
-          <w:iCs/>
-          <w:i/>
-        </w:rPr>
-        <w:t xml:space="preserve">R</w:t>
-      </w:r>
-      <w:r>
-        <w:rPr>
-          <w:vertAlign w:val="subscript"/>
-        </w:rPr>
-        <w:t xml:space="preserve">0</w:t>
-      </w:r>
-      <w:r>
-        <w:rPr>
-          <w:vertAlign w:val="superscript"/>
-        </w:rPr>
-        <w:t xml:space="preserve">2</w:t>
-      </w:r>
-      <w:r>
-        <w:t xml:space="preserve"> </w:t>
-      </w:r>
-      <w:r>
-        <w:t xml:space="preserve">is convex and never increasing in the control intensities (Proposition 7), the cheapest plan that meets a target is a convex program. Algorithm 1 solved it with a certified gap; a fine grid and a general nonlinear solver never found a cheaper feasible plan in 120 cases. The linear-program certificate of Proposition 9 always met the target and cost on average 14.5 percent more.</w:t>
-      </w:r>
-    </w:p>
-    <w:p>
-      <w:pPr>
-        <w:pStyle w:val="BodyText"/>
-      </w:pPr>
-      <w:r>
-        <w:rPr>
-          <w:bCs/>
-          <w:b/>
-        </w:rPr>
-        <w:t xml:space="preserve">Objective 5: infections traced to places.</w:t>
-      </w:r>
-      <w:r>
-        <w:t xml:space="preserve"> </w:t>
-      </w:r>
-      <w:r>
-        <w:t xml:space="preserve">When residents spend more than half of their biting hours at home, the residence-time matrix can be inverted, and Proposition 11 bounds the error of the inverse. In noisy synthetic data, the inferred distribution of infections was closer to the truth than the distribution of cases by residence in 373 of 400 instances.</w:t>
-      </w:r>
-    </w:p>
-    <w:p>
-      <w:pPr>
-        <w:pStyle w:val="BodyText"/>
-      </w:pPr>
-      <w:r>
-        <w:rPr>
-          <w:bCs/>
-          <w:b/>
-        </w:rPr>
-        <w:t xml:space="preserve">Objective 6: the outbreak alarm.</w:t>
-      </w:r>
-      <w:r>
-        <w:t xml:space="preserve"> </w:t>
-      </w:r>
-      <w:r>
-        <w:t xml:space="preserve">Proposition 12 gave the CUSUM alarm a worst-case delay and an exact average run length. The Markov-chain values fell inside the 95 percent interval of 20,000 simulated runs in every design.</w:t>
-      </w:r>
-    </w:p>
-    <w:p>
-      <w:pPr>
-        <w:pStyle w:val="BodyText"/>
-      </w:pPr>
-      <w:r>
-        <w:rPr>
-          <w:bCs/>
-          <w:b/>
-        </w:rPr>
-        <w:t xml:space="preserve">Objective 7: verification.</w:t>
-      </w:r>
-      <w:r>
-        <w:t xml:space="preserve"> </w:t>
-      </w:r>
-      <w:r>
-        <w:t xml:space="preserve">All twelve propositions were checked numerically against independent code, and Table 7 records no failure. On 720 barangays, the size of Albay, the reproduction number and the place shares take under a second, and the certified least-cost plan about a minute.</w:t>
-      </w:r>
-    </w:p>
-    <w:p>
-      <w:pPr>
-        <w:pStyle w:val="BodyText"/>
-      </w:pPr>
-      <w:r>
-        <w:rPr>
-          <w:bCs/>
-          <w:b/>
-        </w:rPr>
-        <w:t xml:space="preserve">Objective 8: the worked instance.</w:t>
-      </w:r>
-      <w:r>
-        <w:t xml:space="preserve"> </w:t>
-      </w:r>
-      <w:r>
-        <w:t xml:space="preserve">In the six-barangay test network D1, case addresses pointed to the residential barangay B2, while 42.6 percent of transmission happened in the poblacion B1 with its school and market. The least-cost plan reached</w:t>
-      </w:r>
-      <w:r>
-        <w:t xml:space="preserve"> </w:t>
-      </w:r>
-      <w:r>
-        <w:rPr>
-          <w:iCs/>
-          <w:i/>
-        </w:rPr>
-        <w:t xml:space="preserve">R</w:t>
-      </w:r>
-      <w:r>
-        <w:rPr>
-          <w:vertAlign w:val="subscript"/>
-        </w:rPr>
-        <w:t xml:space="preserve">0</w:t>
-      </w:r>
-      <w:r>
-        <w:t xml:space="preserve"> </w:t>
-      </w:r>
-      <w:r>
-        <w:t xml:space="preserve">≤ 0.95 with 22.60 team-days, 40 percent below uniform control and 42 percent below control where cases live. At the same false-alarm rate, the CUSUM alarm sounded 1.7 weeks earlier on average than a single-week threshold. The eight hypotheses of Section 3.6.3 were recorded before any Albay result existed.</w:t>
-      </w:r>
-    </w:p>
-    <w:bookmarkEnd w:id="144"/>
-    <w:bookmarkStart w:id="145" w:name="limitations"/>
-    <w:p>
-      <w:pPr>
-        <w:pStyle w:val="Heading2"/>
-      </w:pPr>
-      <w:r>
-        <w:t xml:space="preserve">4.2 Limitations</w:t>
       </w:r>
     </w:p>
     <w:p>
@@ -24894,13 +24455,13 @@
           <w:bCs/>
           <w:b/>
         </w:rPr>
-        <w:t xml:space="preserve">(L1) The worked numbers are synthetic.</w:t>
-      </w:r>
-      <w:r>
-        <w:t xml:space="preserve"> </w:t>
-      </w:r>
-      <w:r>
-        <w:t xml:space="preserve">D1 is a made-up town. Its tables show that the pipeline behaves as the propositions say; they are not estimates for Legazpi, Daraga, or any real barangay.</w:t>
+        <w:t xml:space="preserve">H1.</w:t>
+      </w:r>
+      <w:r>
+        <w:t xml:space="preserve"> </w:t>
+      </w:r>
+      <w:r>
+        <w:t xml:space="preserve">Albay’s network reproduction number is at least 10 percent higher than its provincial-average value; this holds if the whole bootstrap interval of the ratio sits above 1.10.</w:t>
       </w:r>
     </w:p>
     <w:p>
@@ -24916,42 +24477,13 @@
           <w:bCs/>
           <w:b/>
         </w:rPr>
-        <w:t xml:space="preserve">(L2) Routines are fixed.</w:t>
-      </w:r>
-      <w:r>
-        <w:t xml:space="preserve"> </w:t>
-      </w:r>
-      <w:r>
-        <w:t xml:space="preserve">The matrix</w:t>
-      </w:r>
-      <w:r>
-        <w:t xml:space="preserve"> </w:t>
-      </w:r>
-      <w:r>
-        <w:rPr>
-          <w:iCs/>
-          <w:i/>
-        </w:rPr>
-        <w:t xml:space="preserve">P</w:t>
-      </w:r>
-      <w:r>
-        <w:t xml:space="preserve"> </w:t>
-      </w:r>
-      <w:r>
-        <w:t xml:space="preserve">describes an average weekday. Weekends, fiestas, class suspensions, and the habit of staying home when sick all change it. School closures can be studied by recomputing</w:t>
-      </w:r>
-      <w:r>
-        <w:t xml:space="preserve"> </w:t>
-      </w:r>
-      <w:r>
-        <w:rPr>
-          <w:iCs/>
-          <w:i/>
-        </w:rPr>
-        <w:t xml:space="preserve">P</w:t>
-      </w:r>
-      <w:r>
-        <w:t xml:space="preserve">, but the model does not predict how people will change their routines.</w:t>
+        <w:t xml:space="preserve">H2.</w:t>
+      </w:r>
+      <w:r>
+        <w:t xml:space="preserve"> </w:t>
+      </w:r>
+      <w:r>
+        <w:t xml:space="preserve">In more than half of the municipalities with ten or more barangays, the barangay with the largest share of transmission hosts a central school or a public market.</w:t>
       </w:r>
     </w:p>
     <w:p>
@@ -24967,13 +24499,13 @@
           <w:bCs/>
           <w:b/>
         </w:rPr>
-        <w:t xml:space="preserve">(L3) Mosquito numbers are hard to measure.</w:t>
-      </w:r>
-      <w:r>
-        <w:t xml:space="preserve"> </w:t>
-      </w:r>
-      <w:r>
-        <w:t xml:space="preserve">Larval and ovitrap indices are rough proxies for adult female mosquitoes, and the conversion between them varies by place and season. The rankings depend on relative densities, which are more reliable than absolute ones, but the reproduction number itself carries the error of the survey.</w:t>
+        <w:t xml:space="preserve">H3.</w:t>
+      </w:r>
+      <w:r>
+        <w:t xml:space="preserve"> </w:t>
+      </w:r>
+      <w:r>
+        <w:t xml:space="preserve">In at least half of the municipalities, the barangay with the most reported cases is not the barangay with the most inferred infections.</w:t>
       </w:r>
     </w:p>
     <w:p>
@@ -24989,13 +24521,13 @@
           <w:bCs/>
           <w:b/>
         </w:rPr>
-        <w:t xml:space="preserve">(L4) One virus, no immunity history.</w:t>
-      </w:r>
-      <w:r>
-        <w:t xml:space="preserve"> </w:t>
-      </w:r>
-      <w:r>
-        <w:t xml:space="preserve">Four serotypes circulate in the Philippines, and past infections change who can be infected again. The model treats dengue as one infection in a fully susceptible population, so its reproduction number describes potential, not the course of a particular season.</w:t>
+        <w:t xml:space="preserve">H4.</w:t>
+      </w:r>
+      <w:r>
+        <w:t xml:space="preserve"> </w:t>
+      </w:r>
+      <w:r>
+        <w:t xml:space="preserve">The least-cost plan costs at least 25 percent less than uniform control at the same target in a majority of municipalities.</w:t>
       </w:r>
     </w:p>
     <w:p>
@@ -25011,13 +24543,13 @@
           <w:bCs/>
           <w:b/>
         </w:rPr>
-        <w:t xml:space="preserve">(L5) Constant parameters.</w:t>
-      </w:r>
-      <w:r>
-        <w:t xml:space="preserve"> </w:t>
-      </w:r>
-      <w:r>
-        <w:t xml:space="preserve">Biting rate, incubation period, and mosquito lifetime change with temperature (Mordecai et al., 2017). The season factor scales mosquito numbers only; it does not change the other parameters within a season.</w:t>
+        <w:t xml:space="preserve">H5.</w:t>
+      </w:r>
+      <w:r>
+        <w:t xml:space="preserve"> </w:t>
+      </w:r>
+      <w:r>
+        <w:t xml:space="preserve">The certificate plan costs at most 30 percent more than the least-cost plan, so that it can serve as a quick, safe plan during a surge.</w:t>
       </w:r>
     </w:p>
     <w:p>
@@ -25033,13 +24565,13 @@
           <w:bCs/>
           <w:b/>
         </w:rPr>
-        <w:t xml:space="preserve">(L6) Control acts on numbers only.</w:t>
-      </w:r>
-      <w:r>
-        <w:t xml:space="preserve"> </w:t>
-      </w:r>
-      <w:r>
-        <w:t xml:space="preserve">Each method is reduced to a fraction of mosquitoes removed at a cost proportional to that fraction. Real methods differ in how long they last, how quickly mosquitoes return, and how much they cost to repeat.</w:t>
+        <w:t xml:space="preserve">H6.</w:t>
+      </w:r>
+      <w:r>
+        <w:t xml:space="preserve"> </w:t>
+      </w:r>
+      <w:r>
+        <w:t xml:space="preserve">Retrospectively on 2026 data, the CUSUM alarm sounds earlier than the single-week rule in at least 12 of the 18 municipalities.</w:t>
       </w:r>
     </w:p>
     <w:p>
@@ -25055,13 +24587,29 @@
           <w:bCs/>
           <w:b/>
         </w:rPr>
-        <w:t xml:space="preserve">(L7) Reporting is assumed uniform.</w:t>
-      </w:r>
-      <w:r>
-        <w:t xml:space="preserve"> </w:t>
-      </w:r>
-      <w:r>
-        <w:t xml:space="preserve">Assumption 5 treats reported cases as the same fraction of infections everywhere. If people in remote barangays consult less often, the inversion will understate infections there.</w:t>
+        <w:t xml:space="preserve">H7.</w:t>
+      </w:r>
+      <w:r>
+        <w:t xml:space="preserve"> </w:t>
+      </w:r>
+      <w:r>
+        <w:t xml:space="preserve">The ranking of places by share is stable across the sweeps (Spearman’s</w:t>
+      </w:r>
+      <w:r>
+        <w:t xml:space="preserve"> </w:t>
+      </w:r>
+      <w:r>
+        <w:rPr>
+          <w:iCs/>
+          <w:i/>
+        </w:rPr>
+        <w:t xml:space="preserve">ρ</w:t>
+      </w:r>
+      <w:r>
+        <w:t xml:space="preserve"> </w:t>
+      </w:r>
+      <w:r>
+        <w:t xml:space="preserve">above 0.8).</w:t>
       </w:r>
     </w:p>
     <w:p>
@@ -25077,20 +24625,424 @@
           <w:bCs/>
           <w:b/>
         </w:rPr>
-        <w:t xml:space="preserve">(L8) Time away above one half.</w:t>
-      </w:r>
-      <w:r>
-        <w:t xml:space="preserve"> </w:t>
-      </w:r>
-      <w:r>
-        <w:t xml:space="preserve">The error bound of Proposition 11 needs every barangay to keep its residents home for more than half of the biting hours. A barangay whose residents mostly commute out would weaken the bound, though the nonnegative least-squares inverse still applies.</w:t>
+        <w:t xml:space="preserve">H8.</w:t>
+      </w:r>
+      <w:r>
+        <w:t xml:space="preserve"> </w:t>
+      </w:r>
+      <w:r>
+        <w:t xml:space="preserve">Propositions 7 and 10 make monotonicity exact; any computed violation will be treated as a data error and the inputs checked.</w:t>
+      </w:r>
+    </w:p>
+    <w:bookmarkEnd w:id="144"/>
+    <w:bookmarkStart w:id="145" w:name="sensitivity-sweeps"/>
+    <w:p>
+      <w:pPr>
+        <w:pStyle w:val="Heading3"/>
+      </w:pPr>
+      <w:r>
+        <w:t xml:space="preserve">3.6.4 Sensitivity Sweeps</w:t>
+      </w:r>
+    </w:p>
+    <w:p>
+      <w:pPr>
+        <w:pStyle w:val="FirstParagraph"/>
+      </w:pPr>
+      <w:r>
+        <w:t xml:space="preserve">Each sweep of Section 3.6.1 recomputes the reproduction number, the place shares, the five strategies, and the alarm weeks. The results will be reported with the hypotheses above.</w:t>
+      </w:r>
+    </w:p>
+    <w:bookmarkEnd w:id="145"/>
+    <w:bookmarkEnd w:id="146"/>
+    <w:bookmarkEnd w:id="147"/>
+    <w:bookmarkStart w:id="152" w:name="conclusions"/>
+    <w:p>
+      <w:pPr>
+        <w:pStyle w:val="Heading1"/>
+      </w:pPr>
+      <w:r>
+        <w:t xml:space="preserve">4. CONCLUSIONS</w:t>
+      </w:r>
+    </w:p>
+    <w:bookmarkStart w:id="148" w:name="summary-of-the-findings"/>
+    <w:p>
+      <w:pPr>
+        <w:pStyle w:val="Heading2"/>
+      </w:pPr>
+      <w:r>
+        <w:t xml:space="preserve">4.1 Summary of the Findings</w:t>
+      </w:r>
+    </w:p>
+    <w:p>
+      <w:pPr>
+        <w:pStyle w:val="FirstParagraph"/>
+      </w:pPr>
+      <w:r>
+        <w:t xml:space="preserve">The central question was whether a health office could see where dengue is transmitted, decide how much control is enough and where to put it, and know when an outbreak has begun, using only open data and a laptop. The answer is yes for the mathematics: each of these tasks became a precise problem with a proven solution, and each proof survived a check against code written separately from the model. Whether the answer is also yes for Albay depends on the field data that the open-data instance will supply.</w:t>
+      </w:r>
+    </w:p>
+    <w:p>
+      <w:pPr>
+        <w:pStyle w:val="BodyText"/>
+      </w:pPr>
+      <w:r>
+        <w:rPr>
+          <w:bCs/>
+          <w:b/>
+        </w:rPr>
+        <w:t xml:space="preserve">Objective 1: the residence-time network.</w:t>
+      </w:r>
+      <w:r>
+        <w:t xml:space="preserve"> </w:t>
+      </w:r>
+      <w:r>
+        <w:t xml:space="preserve">Definitions 1 to 4 turned barangay populations, travel times, the pull of schools, markets, and workplaces, and mosquito indices into a matrix</w:t>
+      </w:r>
+      <w:r>
+        <w:t xml:space="preserve"> </w:t>
+      </w:r>
+      <w:r>
+        <w:rPr>
+          <w:iCs/>
+          <w:i/>
+        </w:rPr>
+        <w:t xml:space="preserve">P</w:t>
+      </w:r>
+      <w:r>
+        <w:t xml:space="preserve"> </w:t>
+      </w:r>
+      <w:r>
+        <w:t xml:space="preserve">of biting hours. Every row of</w:t>
+      </w:r>
+      <w:r>
+        <w:t xml:space="preserve"> </w:t>
+      </w:r>
+      <w:r>
+        <w:rPr>
+          <w:iCs/>
+          <w:i/>
+        </w:rPr>
+        <w:t xml:space="preserve">P</w:t>
+      </w:r>
+      <w:r>
+        <w:t xml:space="preserve"> </w:t>
+      </w:r>
+      <w:r>
+        <w:t xml:space="preserve">sums to one, and every entry has a public source or a declared value.</w:t>
+      </w:r>
+    </w:p>
+    <w:p>
+      <w:pPr>
+        <w:pStyle w:val="BodyText"/>
+      </w:pPr>
+      <w:r>
+        <w:rPr>
+          <w:bCs/>
+          <w:b/>
+        </w:rPr>
+        <w:t xml:space="preserve">Objective 2: the reproduction number and its bounds.</w:t>
+      </w:r>
+      <w:r>
+        <w:t xml:space="preserve"> </w:t>
+      </w:r>
+      <w:r>
+        <w:t xml:space="preserve">Proposition 1 wrote</w:t>
+      </w:r>
+      <w:r>
+        <w:t xml:space="preserve"> </w:t>
+      </w:r>
+      <w:r>
+        <w:rPr>
+          <w:iCs/>
+          <w:i/>
+        </w:rPr>
+        <w:t xml:space="preserve">R</w:t>
+      </w:r>
+      <w:r>
+        <w:rPr>
+          <w:vertAlign w:val="subscript"/>
+        </w:rPr>
+        <w:t xml:space="preserve">0</w:t>
+      </w:r>
+      <w:r>
+        <w:rPr>
+          <w:vertAlign w:val="superscript"/>
+        </w:rPr>
+        <w:t xml:space="preserve">2</w:t>
+      </w:r>
+      <w:r>
+        <w:t xml:space="preserve"> </w:t>
+      </w:r>
+      <w:r>
+        <w:t xml:space="preserve">as the largest eigenvalue of a symmetric positive semidefinite matrix, and Proposition 2 tied its threshold to the growth of infection. The formula matched a numerical next-generation matrix to within 5.3 × 10</w:t>
+      </w:r>
+      <w:r>
+        <w:rPr>
+          <w:vertAlign w:val="superscript"/>
+        </w:rPr>
+        <w:t xml:space="preserve">−15</w:t>
+      </w:r>
+      <w:r>
+        <w:t xml:space="preserve"> </w:t>
+      </w:r>
+      <w:r>
+        <w:t xml:space="preserve">in 300 random networks. Propositions 4 and 5 then trapped</w:t>
+      </w:r>
+      <w:r>
+        <w:t xml:space="preserve"> </w:t>
+      </w:r>
+      <w:r>
+        <w:rPr>
+          <w:iCs/>
+          <w:i/>
+        </w:rPr>
+        <w:t xml:space="preserve">R</w:t>
+      </w:r>
+      <w:r>
+        <w:rPr>
+          <w:vertAlign w:val="subscript"/>
+        </w:rPr>
+        <w:t xml:space="preserve">0</w:t>
+      </w:r>
+      <w:r>
+        <w:rPr>
+          <w:vertAlign w:val="superscript"/>
+        </w:rPr>
+        <w:t xml:space="preserve">2</w:t>
+      </w:r>
+      <w:r>
+        <w:t xml:space="preserve"> </w:t>
+      </w:r>
+      <w:r>
+        <w:t xml:space="preserve">between the smallest and largest local exposure numbers and showed that the provincial average can only understate it; no violation appeared in 500 instances.</w:t>
+      </w:r>
+    </w:p>
+    <w:p>
+      <w:pPr>
+        <w:pStyle w:val="BodyText"/>
+      </w:pPr>
+      <w:r>
+        <w:rPr>
+          <w:bCs/>
+          <w:b/>
+        </w:rPr>
+        <w:t xml:space="preserve">Objective 3: ranking places.</w:t>
+      </w:r>
+      <w:r>
+        <w:t xml:space="preserve"> </w:t>
+      </w:r>
+      <w:r>
+        <w:t xml:space="preserve">Proposition 6 split</w:t>
+      </w:r>
+      <w:r>
+        <w:t xml:space="preserve"> </w:t>
+      </w:r>
+      <w:r>
+        <w:rPr>
+          <w:iCs/>
+          <w:i/>
+        </w:rPr>
+        <w:t xml:space="preserve">R</w:t>
+      </w:r>
+      <w:r>
+        <w:rPr>
+          <w:vertAlign w:val="subscript"/>
+        </w:rPr>
+        <w:t xml:space="preserve">0</w:t>
+      </w:r>
+      <w:r>
+        <w:rPr>
+          <w:vertAlign w:val="superscript"/>
+        </w:rPr>
+        <w:t xml:space="preserve">2</w:t>
+      </w:r>
+      <w:r>
+        <w:t xml:space="preserve"> </w:t>
+      </w:r>
+      <w:r>
+        <w:t xml:space="preserve">into place shares that add to one and showed that each share is, up to a known factor, the rate at which control at that place lowers</w:t>
+      </w:r>
+      <w:r>
+        <w:t xml:space="preserve"> </w:t>
+      </w:r>
+      <w:r>
+        <w:rPr>
+          <w:iCs/>
+          <w:i/>
+        </w:rPr>
+        <w:t xml:space="preserve">R</w:t>
+      </w:r>
+      <w:r>
+        <w:rPr>
+          <w:vertAlign w:val="subscript"/>
+        </w:rPr>
+        <w:t xml:space="preserve">0</w:t>
+      </w:r>
+      <w:r>
+        <w:rPr>
+          <w:vertAlign w:val="superscript"/>
+        </w:rPr>
+        <w:t xml:space="preserve">2</w:t>
+      </w:r>
+      <w:r>
+        <w:t xml:space="preserve">. Shares and gradients agreed with finite differences in all 300 checks.</w:t>
+      </w:r>
+    </w:p>
+    <w:p>
+      <w:pPr>
+        <w:pStyle w:val="BodyText"/>
+      </w:pPr>
+      <w:r>
+        <w:rPr>
+          <w:bCs/>
+          <w:b/>
+        </w:rPr>
+        <w:t xml:space="preserve">Objective 4: least-cost control.</w:t>
+      </w:r>
+      <w:r>
+        <w:t xml:space="preserve"> </w:t>
+      </w:r>
+      <w:r>
+        <w:t xml:space="preserve">Because</w:t>
+      </w:r>
+      <w:r>
+        <w:t xml:space="preserve"> </w:t>
+      </w:r>
+      <w:r>
+        <w:rPr>
+          <w:iCs/>
+          <w:i/>
+        </w:rPr>
+        <w:t xml:space="preserve">R</w:t>
+      </w:r>
+      <w:r>
+        <w:rPr>
+          <w:vertAlign w:val="subscript"/>
+        </w:rPr>
+        <w:t xml:space="preserve">0</w:t>
+      </w:r>
+      <w:r>
+        <w:rPr>
+          <w:vertAlign w:val="superscript"/>
+        </w:rPr>
+        <w:t xml:space="preserve">2</w:t>
+      </w:r>
+      <w:r>
+        <w:t xml:space="preserve"> </w:t>
+      </w:r>
+      <w:r>
+        <w:t xml:space="preserve">is convex and never increasing in the control intensities (Proposition 7), the cheapest plan that meets a target is a convex program. Algorithm 1 solved it with a certified gap; a fine grid and a general nonlinear solver never found a cheaper feasible plan in 120 cases. The linear-program certificate of Proposition 9 always met the target and cost on average 14.5 percent more.</w:t>
+      </w:r>
+    </w:p>
+    <w:p>
+      <w:pPr>
+        <w:pStyle w:val="BodyText"/>
+      </w:pPr>
+      <w:r>
+        <w:rPr>
+          <w:bCs/>
+          <w:b/>
+        </w:rPr>
+        <w:t xml:space="preserve">Objective 5: infections traced to places.</w:t>
+      </w:r>
+      <w:r>
+        <w:t xml:space="preserve"> </w:t>
+      </w:r>
+      <w:r>
+        <w:t xml:space="preserve">When residents spend more than half of their biting hours at home, the residence-time matrix can be inverted, and Proposition 11 bounds the error of the inverse. In noisy synthetic data, the inferred distribution of infections was closer to the truth than the distribution of cases by residence in 373 of 400 instances.</w:t>
+      </w:r>
+    </w:p>
+    <w:p>
+      <w:pPr>
+        <w:pStyle w:val="BodyText"/>
+      </w:pPr>
+      <w:r>
+        <w:rPr>
+          <w:bCs/>
+          <w:b/>
+        </w:rPr>
+        <w:t xml:space="preserve">Objective 6: the outbreak alarm.</w:t>
+      </w:r>
+      <w:r>
+        <w:t xml:space="preserve"> </w:t>
+      </w:r>
+      <w:r>
+        <w:t xml:space="preserve">Proposition 12 gave the CUSUM alarm a worst-case delay and an exact average run length. The Markov-chain values fell inside the 95 percent interval of 20,000 simulated runs in every design.</w:t>
+      </w:r>
+    </w:p>
+    <w:p>
+      <w:pPr>
+        <w:pStyle w:val="BodyText"/>
+      </w:pPr>
+      <w:r>
+        <w:rPr>
+          <w:bCs/>
+          <w:b/>
+        </w:rPr>
+        <w:t xml:space="preserve">Objective 7: verification.</w:t>
+      </w:r>
+      <w:r>
+        <w:t xml:space="preserve"> </w:t>
+      </w:r>
+      <w:r>
+        <w:t xml:space="preserve">All twelve propositions were checked numerically against independent code, and Table 7 records no failure. On 720 barangays, the size of Albay, the reproduction number and the place shares take under a second, and the certified least-cost plan about a minute.</w:t>
+      </w:r>
+    </w:p>
+    <w:p>
+      <w:pPr>
+        <w:pStyle w:val="BodyText"/>
+      </w:pPr>
+      <w:r>
+        <w:rPr>
+          <w:bCs/>
+          <w:b/>
+        </w:rPr>
+        <w:t xml:space="preserve">Objective 8: the worked instance.</w:t>
+      </w:r>
+      <w:r>
+        <w:t xml:space="preserve"> </w:t>
+      </w:r>
+      <w:r>
+        <w:t xml:space="preserve">In the six-barangay test network D1, case addresses pointed to the residential barangay B2, while 42.6 percent of transmission happened in the poblacion B1 with its school and market. The least-cost plan reached</w:t>
+      </w:r>
+      <w:r>
+        <w:t xml:space="preserve"> </w:t>
+      </w:r>
+      <w:r>
+        <w:rPr>
+          <w:iCs/>
+          <w:i/>
+        </w:rPr>
+        <w:t xml:space="preserve">R</w:t>
+      </w:r>
+      <w:r>
+        <w:rPr>
+          <w:vertAlign w:val="subscript"/>
+        </w:rPr>
+        <w:t xml:space="preserve">0</w:t>
+      </w:r>
+      <w:r>
+        <w:t xml:space="preserve"> </w:t>
+      </w:r>
+      <w:r>
+        <w:t xml:space="preserve">≤ 0.95 with 22.60 team-days, 40 percent below uniform control and 42 percent below control where cases live. At the same false-alarm rate, the CUSUM alarm sounded 1.7 weeks earlier on average than a single-week threshold. The eight hypotheses of Section 3.6.3 were recorded before any Albay result existed.</w:t>
+      </w:r>
+    </w:p>
+    <w:bookmarkEnd w:id="148"/>
+    <w:bookmarkStart w:id="149" w:name="limitations"/>
+    <w:p>
+      <w:pPr>
+        <w:pStyle w:val="Heading2"/>
+      </w:pPr>
+      <w:r>
+        <w:t xml:space="preserve">4.2 Limitations</w:t>
       </w:r>
     </w:p>
     <w:p>
       <w:pPr>
         <w:numPr>
           <w:ilvl w:val="0"/>
-          <w:numId w:val="1007"/>
+          <w:numId w:val="1008"/>
         </w:numPr>
         <w:pStyle w:val="Compact"/>
       </w:pPr>
@@ -25099,20 +25051,20 @@
           <w:bCs/>
           <w:b/>
         </w:rPr>
-        <w:t xml:space="preserve">(L9) A barangay is not a household.</w:t>
-      </w:r>
-      <w:r>
-        <w:t xml:space="preserve"> </w:t>
-      </w:r>
-      <w:r>
-        <w:t xml:space="preserve">Transmission happens between houses a few dozen meters apart (Stoddard et al., 2013). The model works at the barangay level, which matches the reporting and the brigades but averages over finer differences.</w:t>
+        <w:t xml:space="preserve">(L1) The worked numbers are synthetic.</w:t>
+      </w:r>
+      <w:r>
+        <w:t xml:space="preserve"> </w:t>
+      </w:r>
+      <w:r>
+        <w:t xml:space="preserve">D1 is a made-up town. Its tables show that the pipeline behaves as the propositions say; they are not estimates for Legazpi, Daraga, or any real barangay.</w:t>
       </w:r>
     </w:p>
     <w:p>
       <w:pPr>
         <w:numPr>
           <w:ilvl w:val="0"/>
-          <w:numId w:val="1007"/>
+          <w:numId w:val="1008"/>
         </w:numPr>
         <w:pStyle w:val="Compact"/>
       </w:pPr>
@@ -25121,211 +25073,246 @@
           <w:bCs/>
           <w:b/>
         </w:rPr>
-        <w:t xml:space="preserve">(L10) The alarm assumes Poisson counts.</w:t>
-      </w:r>
-      <w:r>
-        <w:t xml:space="preserve"> </w:t>
-      </w:r>
-      <w:r>
-        <w:t xml:space="preserve">Weekly counts that cluster more than a Poisson variable would sound false alarms more often than computed. Once past seasons are on file, the design can be tuned to them.</w:t>
-      </w:r>
-    </w:p>
-    <w:bookmarkEnd w:id="145"/>
-    <w:bookmarkStart w:id="146" w:name="recommendations-and-next-steps"/>
-    <w:p>
-      <w:pPr>
-        <w:pStyle w:val="Heading2"/>
-      </w:pPr>
-      <w:r>
-        <w:t xml:space="preserve">4.3 Recommendations and Next Steps</w:t>
-      </w:r>
-    </w:p>
-    <w:p>
-      <w:pPr>
-        <w:pStyle w:val="FirstParagraph"/>
+        <w:t xml:space="preserve">(L2) Routines are fixed.</w:t>
+      </w:r>
+      <w:r>
+        <w:t xml:space="preserve"> </w:t>
+      </w:r>
+      <w:r>
+        <w:t xml:space="preserve">The matrix</w:t>
+      </w:r>
+      <w:r>
+        <w:t xml:space="preserve"> </w:t>
+      </w:r>
+      <w:r>
+        <w:rPr>
+          <w:iCs/>
+          <w:i/>
+        </w:rPr>
+        <w:t xml:space="preserve">P</w:t>
+      </w:r>
+      <w:r>
+        <w:t xml:space="preserve"> </w:t>
+      </w:r>
+      <w:r>
+        <w:t xml:space="preserve">describes an average weekday. Weekends, fiestas, class suspensions, and the habit of staying home when sick all change it. School closures can be studied by recomputing</w:t>
+      </w:r>
+      <w:r>
+        <w:t xml:space="preserve"> </w:t>
+      </w:r>
+      <w:r>
+        <w:rPr>
+          <w:iCs/>
+          <w:i/>
+        </w:rPr>
+        <w:t xml:space="preserve">P</w:t>
+      </w:r>
+      <w:r>
+        <w:t xml:space="preserve">, but the model does not predict how people will change their routines.</w:t>
+      </w:r>
+    </w:p>
+    <w:p>
+      <w:pPr>
+        <w:numPr>
+          <w:ilvl w:val="0"/>
+          <w:numId w:val="1008"/>
+        </w:numPr>
+        <w:pStyle w:val="Compact"/>
       </w:pPr>
       <w:r>
         <w:rPr>
           <w:bCs/>
           <w:b/>
         </w:rPr>
-        <w:t xml:space="preserve">Build the Albay instance.</w:t>
-      </w:r>
-      <w:r>
-        <w:t xml:space="preserve"> </w:t>
-      </w:r>
-      <w:r>
-        <w:t xml:space="preserve">The next step is the full network: the 720 barangays with their census populations, travel times from the companion study (Brimbuela et al., 2026), attraction from the DepEd masterlist and the market and business registers of each local government, and mosquito indices from the entomological surveys of the provincial and regional health offices. The hypotheses of Section 3.6.3 should then be tested exactly as written.</w:t>
-      </w:r>
-    </w:p>
-    <w:p>
-      <w:pPr>
-        <w:pStyle w:val="BodyText"/>
+        <w:t xml:space="preserve">(L3) Mosquito numbers are hard to measure.</w:t>
+      </w:r>
+      <w:r>
+        <w:t xml:space="preserve"> </w:t>
+      </w:r>
+      <w:r>
+        <w:t xml:space="preserve">Larval and ovitrap indices are rough proxies for adult female mosquitoes, and the conversion between them varies by place and season. The rankings depend on relative densities, which are more reliable than absolute ones, but the reproduction number itself carries the error of the survey.</w:t>
+      </w:r>
+    </w:p>
+    <w:p>
+      <w:pPr>
+        <w:numPr>
+          <w:ilvl w:val="0"/>
+          <w:numId w:val="1008"/>
+        </w:numPr>
+        <w:pStyle w:val="Compact"/>
       </w:pPr>
       <w:r>
         <w:rPr>
           <w:bCs/>
           <w:b/>
         </w:rPr>
-        <w:t xml:space="preserve">Ask about daily movement.</w:t>
-      </w:r>
-      <w:r>
-        <w:t xml:space="preserve"> </w:t>
-      </w:r>
-      <w:r>
-        <w:t xml:space="preserve">A short school-based questionnaire on where students and their families spend the daylight hours would give a direct estimate of</w:t>
-      </w:r>
-      <w:r>
-        <w:t xml:space="preserve"> </w:t>
-      </w:r>
-      <w:r>
-        <w:rPr>
-          <w:iCs/>
-          <w:i/>
-        </w:rPr>
-        <w:t xml:space="preserve">P</w:t>
-      </w:r>
-      <w:r>
-        <w:t xml:space="preserve"> </w:t>
-      </w:r>
-      <w:r>
-        <w:t xml:space="preserve">for a sample of barangays and test the destination-choice rule of Definition 2. Mobile phone data, where a provider releases them in aggregate form, could serve the same purpose.</w:t>
-      </w:r>
-    </w:p>
-    <w:p>
-      <w:pPr>
-        <w:pStyle w:val="BodyText"/>
+        <w:t xml:space="preserve">(L4) One virus, no immunity history.</w:t>
+      </w:r>
+      <w:r>
+        <w:t xml:space="preserve"> </w:t>
+      </w:r>
+      <w:r>
+        <w:t xml:space="preserve">Four serotypes circulate in the Philippines, and past infections change who can be infected again. The model treats dengue as one infection in a fully susceptible population, so its reproduction number describes potential, not the course of a particular season.</w:t>
+      </w:r>
+    </w:p>
+    <w:p>
+      <w:pPr>
+        <w:numPr>
+          <w:ilvl w:val="0"/>
+          <w:numId w:val="1008"/>
+        </w:numPr>
+        <w:pStyle w:val="Compact"/>
       </w:pPr>
       <w:r>
         <w:rPr>
           <w:bCs/>
           <w:b/>
         </w:rPr>
-        <w:t xml:space="preserve">Record where cases were during the day.</w:t>
-      </w:r>
-      <w:r>
-        <w:t xml:space="preserve"> </w:t>
-      </w:r>
-      <w:r>
-        <w:t xml:space="preserve">The case investigation form already asks for the address. One more line, the barangay where the patient spent most daytime hours in the two weeks before illness, would allow Proposition 11 to be tested against direct reports.</w:t>
-      </w:r>
-    </w:p>
-    <w:p>
-      <w:pPr>
-        <w:pStyle w:val="BodyText"/>
+        <w:t xml:space="preserve">(L5) Constant parameters.</w:t>
+      </w:r>
+      <w:r>
+        <w:t xml:space="preserve"> </w:t>
+      </w:r>
+      <w:r>
+        <w:t xml:space="preserve">Biting rate, incubation period, and mosquito lifetime change with temperature (Mordecai et al., 2017). The season factor scales mosquito numbers only; it does not change the other parameters within a season.</w:t>
+      </w:r>
+    </w:p>
+    <w:p>
+      <w:pPr>
+        <w:numPr>
+          <w:ilvl w:val="0"/>
+          <w:numId w:val="1008"/>
+        </w:numPr>
+        <w:pStyle w:val="Compact"/>
       </w:pPr>
       <w:r>
         <w:rPr>
           <w:bCs/>
           <w:b/>
         </w:rPr>
-        <w:t xml:space="preserve">Let the parameters follow the weather.</w:t>
-      </w:r>
-      <w:r>
-        <w:t xml:space="preserve"> </w:t>
-      </w:r>
-      <w:r>
-        <w:t xml:space="preserve">Making the biting rate and the mosquito lifetime functions of temperature, after Mordecai et al. (2017), and linking the season factor to rainfall would turn the season scaling of Table 13 into a forecast of the control effort needed a few weeks ahead.</w:t>
-      </w:r>
-    </w:p>
-    <w:p>
-      <w:pPr>
-        <w:pStyle w:val="BodyText"/>
+        <w:t xml:space="preserve">(L6) Control acts on numbers only.</w:t>
+      </w:r>
+      <w:r>
+        <w:t xml:space="preserve"> </w:t>
+      </w:r>
+      <w:r>
+        <w:t xml:space="preserve">Each method is reduced to a fraction of mosquitoes removed at a cost proportional to that fraction. Real methods differ in how long they last, how quickly mosquitoes return, and how much they cost to repeat.</w:t>
+      </w:r>
+    </w:p>
+    <w:p>
+      <w:pPr>
+        <w:numPr>
+          <w:ilvl w:val="0"/>
+          <w:numId w:val="1008"/>
+        </w:numPr>
+        <w:pStyle w:val="Compact"/>
       </w:pPr>
       <w:r>
         <w:rPr>
           <w:bCs/>
           <w:b/>
         </w:rPr>
-        <w:t xml:space="preserve">Pilot the brigade allocation.</w:t>
-      </w:r>
-      <w:r>
-        <w:t xml:space="preserve"> </w:t>
-      </w:r>
-      <w:r>
-        <w:t xml:space="preserve">One municipality could allocate its dengue brigades for a season by the least-cost plan while a comparable municipality keeps its usual practice, with weekly case counts and ovitrap indices compared afterward. Such a trial needs the approval of the provincial health office and an ethics review.</w:t>
-      </w:r>
-    </w:p>
-    <w:p>
-      <w:pPr>
-        <w:pStyle w:val="BodyText"/>
+        <w:t xml:space="preserve">(L7) Reporting is assumed uniform.</w:t>
+      </w:r>
+      <w:r>
+        <w:t xml:space="preserve"> </w:t>
+      </w:r>
+      <w:r>
+        <w:t xml:space="preserve">Assumption 5 treats reported cases as the same fraction of infections everywhere. If people in remote barangays consult less often, the inversion will understate infections there.</w:t>
+      </w:r>
+    </w:p>
+    <w:p>
+      <w:pPr>
+        <w:numPr>
+          <w:ilvl w:val="0"/>
+          <w:numId w:val="1008"/>
+        </w:numPr>
+        <w:pStyle w:val="Compact"/>
       </w:pPr>
       <w:r>
         <w:rPr>
           <w:bCs/>
           <w:b/>
         </w:rPr>
-        <w:t xml:space="preserve">Challenges.</w:t>
-      </w:r>
-      <w:r>
-        <w:t xml:space="preserve"> </w:t>
-      </w:r>
-      <w:r>
-        <w:t xml:space="preserve">Mosquito surveys are labor-intensive and seldom cover every barangay; case data are released by municipality rather than by barangay during most of the year; and a planning tool is useful only if the people who allocate brigades trust it. Each output of the model therefore comes with the assumptions it rests on and a plain-language explanation.</w:t>
-      </w:r>
-    </w:p>
-    <w:bookmarkEnd w:id="146"/>
-    <w:bookmarkStart w:id="147" w:name="applications"/>
-    <w:p>
-      <w:pPr>
-        <w:pStyle w:val="Heading2"/>
-      </w:pPr>
-      <w:r>
-        <w:t xml:space="preserve">4.4 Applications</w:t>
-      </w:r>
-    </w:p>
-    <w:p>
-      <w:pPr>
-        <w:pStyle w:val="FirstParagraph"/>
+        <w:t xml:space="preserve">(L8) Time away above one half.</w:t>
+      </w:r>
+      <w:r>
+        <w:t xml:space="preserve"> </w:t>
+      </w:r>
+      <w:r>
+        <w:t xml:space="preserve">The error bound of Proposition 11 needs every barangay to keep its residents home for more than half of the biting hours. A barangay whose residents mostly commute out would weaken the bound, though the nonnegative least-squares inverse still applies.</w:t>
+      </w:r>
+    </w:p>
+    <w:p>
+      <w:pPr>
+        <w:numPr>
+          <w:ilvl w:val="0"/>
+          <w:numId w:val="1008"/>
+        </w:numPr>
+        <w:pStyle w:val="Compact"/>
       </w:pPr>
       <w:r>
         <w:rPr>
           <w:bCs/>
           <w:b/>
         </w:rPr>
-        <w:t xml:space="preserve">For households and schools.</w:t>
-      </w:r>
-      <w:r>
-        <w:t xml:space="preserve"> </w:t>
-      </w:r>
-      <w:r>
-        <w:t xml:space="preserve">A family can see whether its barangay or the places its members visit by day rank high in the share of transmission, and a school head can see whether the school campus is among the places that carry the most transmission, which tells the school when its own cleanup days matter most.</w:t>
-      </w:r>
-    </w:p>
-    <w:p>
-      <w:pPr>
-        <w:pStyle w:val="BodyText"/>
+        <w:t xml:space="preserve">(L9) A barangay is not a household.</w:t>
+      </w:r>
+      <w:r>
+        <w:t xml:space="preserve"> </w:t>
+      </w:r>
+      <w:r>
+        <w:t xml:space="preserve">Transmission happens between houses a few dozen meters apart (Stoddard et al., 2013). The model works at the barangay level, which matches the reporting and the brigades but averages over finer differences.</w:t>
+      </w:r>
+    </w:p>
+    <w:p>
+      <w:pPr>
+        <w:numPr>
+          <w:ilvl w:val="0"/>
+          <w:numId w:val="1008"/>
+        </w:numPr>
+        <w:pStyle w:val="Compact"/>
       </w:pPr>
       <w:r>
         <w:rPr>
           <w:bCs/>
           <w:b/>
         </w:rPr>
-        <w:t xml:space="preserve">For barangay health workers and dengue brigades.</w:t>
-      </w:r>
-      <w:r>
-        <w:t xml:space="preserve"> </w:t>
-      </w:r>
-      <w:r>
-        <w:t xml:space="preserve">The ranking per team-day tells a brigade leader where one more day of cleanup lowers transmission the most, and the least-cost plan turns a target into a schedule of team-days per barangay.</w:t>
-      </w:r>
-    </w:p>
-    <w:p>
-      <w:pPr>
-        <w:pStyle w:val="BodyText"/>
+        <w:t xml:space="preserve">(L10) The alarm assumes Poisson counts.</w:t>
+      </w:r>
+      <w:r>
+        <w:t xml:space="preserve"> </w:t>
+      </w:r>
+      <w:r>
+        <w:t xml:space="preserve">Weekly counts that cluster more than a Poisson variable would sound false alarms more often than computed. Once past seasons are on file, the design can be tuned to them.</w:t>
+      </w:r>
+    </w:p>
+    <w:bookmarkEnd w:id="149"/>
+    <w:bookmarkStart w:id="150" w:name="recommendations-and-next-steps"/>
+    <w:p>
+      <w:pPr>
+        <w:pStyle w:val="Heading2"/>
+      </w:pPr>
+      <w:r>
+        <w:t xml:space="preserve">4.3 Recommendations and Next Steps</w:t>
+      </w:r>
+    </w:p>
+    <w:p>
+      <w:pPr>
+        <w:pStyle w:val="FirstParagraph"/>
       </w:pPr>
       <w:r>
         <w:rPr>
           <w:bCs/>
           <w:b/>
         </w:rPr>
-        <w:t xml:space="preserve">For provincial and municipal health offices.</w:t>
-      </w:r>
-      <w:r>
-        <w:t xml:space="preserve"> </w:t>
-      </w:r>
-      <w:r>
-        <w:t xml:space="preserve">The office can compute the network reproduction number each month, check whether the province average hides places of high risk, convert reported cases into infections by place, and run the CUSUM alarm on weekly counts with a false-alarm rate it chose in advance. The certificate plan gives a quick, always-safe allocation during a surge, and the exact plan says how much cheaper a careful allocation can be.</w:t>
+        <w:t xml:space="preserve">Build the Albay instance.</w:t>
+      </w:r>
+      <w:r>
+        <w:t xml:space="preserve"> </w:t>
+      </w:r>
+      <w:r>
+        <w:t xml:space="preserve">The next step is the full network: the 720 barangays with their census populations, travel times from the companion study (Brimbuela et al., 2026), attraction from the DepEd masterlist and the market and business registers of each local government, and mosquito indices from the entomological surveys of the provincial and regional health offices. The hypotheses of Section 3.6.3 should then be tested exactly as written.</w:t>
       </w:r>
     </w:p>
     <w:p>
@@ -25337,13 +25324,29 @@
           <w:bCs/>
           <w:b/>
         </w:rPr>
-        <w:t xml:space="preserve">For planners.</w:t>
-      </w:r>
-      <w:r>
-        <w:t xml:space="preserve"> </w:t>
-      </w:r>
-      <w:r>
-        <w:t xml:space="preserve">Table 13 shows how many team-days a stronger rainy season will need, which helps the province budget brigade time and supplies before the rains rather than after the cases rise.</w:t>
+        <w:t xml:space="preserve">Ask about daily movement.</w:t>
+      </w:r>
+      <w:r>
+        <w:t xml:space="preserve"> </w:t>
+      </w:r>
+      <w:r>
+        <w:t xml:space="preserve">A short school-based questionnaire on where students and their families spend the daylight hours would give a direct estimate of</w:t>
+      </w:r>
+      <w:r>
+        <w:t xml:space="preserve"> </w:t>
+      </w:r>
+      <w:r>
+        <w:rPr>
+          <w:iCs/>
+          <w:i/>
+        </w:rPr>
+        <w:t xml:space="preserve">P</w:t>
+      </w:r>
+      <w:r>
+        <w:t xml:space="preserve"> </w:t>
+      </w:r>
+      <w:r>
+        <w:t xml:space="preserve">for a sample of barangays and test the destination-choice rule of Definition 2. Mobile phone data, where a provider releases them in aggregate form, could serve the same purpose.</w:t>
       </w:r>
     </w:p>
     <w:p>
@@ -25355,13 +25358,13 @@
           <w:bCs/>
           <w:b/>
         </w:rPr>
-        <w:t xml:space="preserve">Relation to the SDGs.</w:t>
-      </w:r>
-      <w:r>
-        <w:t xml:space="preserve"> </w:t>
-      </w:r>
-      <w:r>
-        <w:t xml:space="preserve">These uses serve target 3.3 by targeting control, target 3.d by giving an early warning with known error rates, and target 4.a by helping keep schools safe places to learn. They remain intended uses until the model is tested in the field.</w:t>
+        <w:t xml:space="preserve">Record where cases were during the day.</w:t>
+      </w:r>
+      <w:r>
+        <w:t xml:space="preserve"> </w:t>
+      </w:r>
+      <w:r>
+        <w:t xml:space="preserve">The case investigation form already asks for the address. One more line, the barangay where the patient spent most daytime hours in the two weeks before illness, would allow Proposition 11 to be tested against direct reports.</w:t>
       </w:r>
     </w:p>
     <w:p>
@@ -25373,6 +25376,160 @@
           <w:bCs/>
           <w:b/>
         </w:rPr>
+        <w:t xml:space="preserve">Let the parameters follow the weather.</w:t>
+      </w:r>
+      <w:r>
+        <w:t xml:space="preserve"> </w:t>
+      </w:r>
+      <w:r>
+        <w:t xml:space="preserve">Making the biting rate and the mosquito lifetime functions of temperature, after Mordecai et al. (2017), and linking the season factor to rainfall would turn the season scaling of Table 13 into a forecast of the control effort needed a few weeks ahead.</w:t>
+      </w:r>
+    </w:p>
+    <w:p>
+      <w:pPr>
+        <w:pStyle w:val="BodyText"/>
+      </w:pPr>
+      <w:r>
+        <w:rPr>
+          <w:bCs/>
+          <w:b/>
+        </w:rPr>
+        <w:t xml:space="preserve">Pilot the brigade allocation.</w:t>
+      </w:r>
+      <w:r>
+        <w:t xml:space="preserve"> </w:t>
+      </w:r>
+      <w:r>
+        <w:t xml:space="preserve">One municipality could allocate its dengue brigades for a season by the least-cost plan while a comparable municipality keeps its usual practice, with weekly case counts and ovitrap indices compared afterward. Such a trial needs the approval of the provincial health office and an ethics review.</w:t>
+      </w:r>
+    </w:p>
+    <w:p>
+      <w:pPr>
+        <w:pStyle w:val="BodyText"/>
+      </w:pPr>
+      <w:r>
+        <w:rPr>
+          <w:bCs/>
+          <w:b/>
+        </w:rPr>
+        <w:t xml:space="preserve">Challenges.</w:t>
+      </w:r>
+      <w:r>
+        <w:t xml:space="preserve"> </w:t>
+      </w:r>
+      <w:r>
+        <w:t xml:space="preserve">Mosquito surveys are labor-intensive and seldom cover every barangay; case data are released by municipality rather than by barangay during most of the year; and a planning tool is useful only if the people who allocate brigades trust it. Each output of the model therefore comes with the assumptions it rests on and a plain-language explanation.</w:t>
+      </w:r>
+    </w:p>
+    <w:bookmarkEnd w:id="150"/>
+    <w:bookmarkStart w:id="151" w:name="applications"/>
+    <w:p>
+      <w:pPr>
+        <w:pStyle w:val="Heading2"/>
+      </w:pPr>
+      <w:r>
+        <w:t xml:space="preserve">4.4 Applications</w:t>
+      </w:r>
+    </w:p>
+    <w:p>
+      <w:pPr>
+        <w:pStyle w:val="FirstParagraph"/>
+      </w:pPr>
+      <w:r>
+        <w:rPr>
+          <w:bCs/>
+          <w:b/>
+        </w:rPr>
+        <w:t xml:space="preserve">For households and schools.</w:t>
+      </w:r>
+      <w:r>
+        <w:t xml:space="preserve"> </w:t>
+      </w:r>
+      <w:r>
+        <w:t xml:space="preserve">A family can see whether its barangay or the places its members visit by day rank high in the share of transmission, and a school head can see whether the school campus is among the places that carry the most transmission, which tells the school when its own cleanup days matter most.</w:t>
+      </w:r>
+    </w:p>
+    <w:p>
+      <w:pPr>
+        <w:pStyle w:val="BodyText"/>
+      </w:pPr>
+      <w:r>
+        <w:rPr>
+          <w:bCs/>
+          <w:b/>
+        </w:rPr>
+        <w:t xml:space="preserve">For barangay health workers and dengue brigades.</w:t>
+      </w:r>
+      <w:r>
+        <w:t xml:space="preserve"> </w:t>
+      </w:r>
+      <w:r>
+        <w:t xml:space="preserve">The ranking per team-day tells a brigade leader where one more day of cleanup lowers transmission the most, and the least-cost plan turns a target into a schedule of team-days per barangay.</w:t>
+      </w:r>
+    </w:p>
+    <w:p>
+      <w:pPr>
+        <w:pStyle w:val="BodyText"/>
+      </w:pPr>
+      <w:r>
+        <w:rPr>
+          <w:bCs/>
+          <w:b/>
+        </w:rPr>
+        <w:t xml:space="preserve">For provincial and municipal health offices.</w:t>
+      </w:r>
+      <w:r>
+        <w:t xml:space="preserve"> </w:t>
+      </w:r>
+      <w:r>
+        <w:t xml:space="preserve">The office can compute the network reproduction number each month, check whether the province average hides places of high risk, convert reported cases into infections by place, and run the CUSUM alarm on weekly counts with a false-alarm rate it chose in advance. The certificate plan gives a quick, always-safe allocation during a surge, and the exact plan says how much cheaper a careful allocation can be.</w:t>
+      </w:r>
+    </w:p>
+    <w:p>
+      <w:pPr>
+        <w:pStyle w:val="BodyText"/>
+      </w:pPr>
+      <w:r>
+        <w:rPr>
+          <w:bCs/>
+          <w:b/>
+        </w:rPr>
+        <w:t xml:space="preserve">For planners.</w:t>
+      </w:r>
+      <w:r>
+        <w:t xml:space="preserve"> </w:t>
+      </w:r>
+      <w:r>
+        <w:t xml:space="preserve">Table 13 shows how many team-days a stronger rainy season will need, which helps the province budget brigade time and supplies before the rains rather than after the cases rise.</w:t>
+      </w:r>
+    </w:p>
+    <w:p>
+      <w:pPr>
+        <w:pStyle w:val="BodyText"/>
+      </w:pPr>
+      <w:r>
+        <w:rPr>
+          <w:bCs/>
+          <w:b/>
+        </w:rPr>
+        <w:t xml:space="preserve">Relation to the SDGs.</w:t>
+      </w:r>
+      <w:r>
+        <w:t xml:space="preserve"> </w:t>
+      </w:r>
+      <w:r>
+        <w:t xml:space="preserve">These uses serve target 3.3 by targeting control, target 3.d by giving an early warning with known error rates, and target 4.a by helping keep schools safe places to learn. They remain intended uses until the model is tested in the field.</w:t>
+      </w:r>
+    </w:p>
+    <w:p>
+      <w:pPr>
+        <w:pStyle w:val="BodyText"/>
+      </w:pPr>
+      <w:r>
+        <w:rPr>
+          <w:bCs/>
+          <w:b/>
+        </w:rPr>
         <w:t xml:space="preserve">Beyond Albay.</w:t>
       </w:r>
       <w:r>
@@ -25395,9 +25552,9 @@
         <w:t xml:space="preserve">-borne diseases such as chikungunya and Zika, could build the same model, since the mathematics does not depend on the virus.</w:t>
       </w:r>
     </w:p>
-    <w:bookmarkEnd w:id="147"/>
-    <w:bookmarkEnd w:id="148"/>
-    <w:bookmarkStart w:id="149" w:name="references"/>
+    <w:bookmarkEnd w:id="151"/>
+    <w:bookmarkEnd w:id="152"/>
+    <w:bookmarkStart w:id="153" w:name="references"/>
     <w:p>
       <w:pPr>
         <w:pStyle w:val="Heading1"/>
@@ -26294,8 +26451,8 @@
         <w:t xml:space="preserve">. World Health Organization.</w:t>
       </w:r>
     </w:p>
-    <w:bookmarkEnd w:id="149"/>
-    <w:bookmarkStart w:id="150" w:name="X2477282538640a378ca7dde049129f7156bfc2f"/>
+    <w:bookmarkEnd w:id="153"/>
+    <w:bookmarkStart w:id="154" w:name="X2477282538640a378ca7dde049129f7156bfc2f"/>
     <w:p>
       <w:pPr>
         <w:pStyle w:val="Heading1"/>
@@ -26967,8 +27124,8 @@
         </w:tc>
       </w:tr>
     </w:tbl>
-    <w:bookmarkEnd w:id="150"/>
-    <w:bookmarkStart w:id="151" w:name="appendix-b.-files-of-the-data-set"/>
+    <w:bookmarkEnd w:id="154"/>
+    <w:bookmarkStart w:id="155" w:name="appendix-b.-files-of-the-data-set"/>
     <w:p>
       <w:pPr>
         <w:pStyle w:val="Heading1"/>
@@ -27255,8 +27412,8 @@
         </w:tc>
       </w:tr>
     </w:tbl>
-    <w:bookmarkEnd w:id="151"/>
-    <w:bookmarkStart w:id="152" w:name="X6c89207cbb002bc11979d12d9bc16952cb112fe"/>
+    <w:bookmarkEnd w:id="155"/>
+    <w:bookmarkStart w:id="156" w:name="X6c89207cbb002bc11979d12d9bc16952cb112fe"/>
     <w:p>
       <w:pPr>
         <w:pStyle w:val="Heading1"/>
@@ -27913,8 +28070,8 @@
         </w:tc>
       </w:tr>
     </w:tbl>
-    <w:bookmarkEnd w:id="152"/>
-    <w:bookmarkStart w:id="153" w:name="X9135c29be196c8fb7f448b17a7807d44f7dc991"/>
+    <w:bookmarkEnd w:id="156"/>
+    <w:bookmarkStart w:id="157" w:name="X9135c29be196c8fb7f448b17a7807d44f7dc991"/>
     <w:p>
       <w:pPr>
         <w:pStyle w:val="Heading1"/>
@@ -27941,46 +28098,6 @@
           <w:b/>
         </w:rPr>
         <w:t xml:space="preserve">Network</w:t>
-      </w:r>
-    </w:p>
-    <w:p>
-      <w:pPr>
-        <w:numPr>
-          <w:ilvl w:val="0"/>
-          <w:numId w:val="1008"/>
-        </w:numPr>
-        <w:pStyle w:val="Compact"/>
-      </w:pPr>
-      <w:r>
-        <w:t xml:space="preserve">An editable table of barangays with residents, mosquitoes per resident, share of the day away, and attraction, with the matrix</w:t>
-      </w:r>
-      <w:r>
-        <w:t xml:space="preserve"> </w:t>
-      </w:r>
-      <w:r>
-        <w:rPr>
-          <w:iCs/>
-          <w:i/>
-        </w:rPr>
-        <w:t xml:space="preserve">P</w:t>
-      </w:r>
-      <w:r>
-        <w:t xml:space="preserve"> </w:t>
-      </w:r>
-      <w:r>
-        <w:t xml:space="preserve">shown as a heat map.</w:t>
-      </w:r>
-    </w:p>
-    <w:p>
-      <w:pPr>
-        <w:pStyle w:val="FirstParagraph"/>
-      </w:pPr>
-      <w:r>
-        <w:rPr>
-          <w:bCs/>
-          <w:b/>
-        </w:rPr>
-        <w:t xml:space="preserve">Transmission</w:t>
       </w:r>
     </w:p>
     <w:p>
@@ -27992,19 +28109,23 @@
         <w:pStyle w:val="Compact"/>
       </w:pPr>
       <w:r>
-        <w:t xml:space="preserve">The network reproduction number, the local exposure numbers with the bounds of Proposition 4, and the province-average value of Proposition 5 (target 3.3).</w:t>
-      </w:r>
-    </w:p>
-    <w:p>
-      <w:pPr>
-        <w:numPr>
-          <w:ilvl w:val="0"/>
-          <w:numId w:val="1009"/>
-        </w:numPr>
-        <w:pStyle w:val="Compact"/>
-      </w:pPr>
-      <w:r>
-        <w:t xml:space="preserve">A bar chart of residents, cases by residence, and transmission by place, and a ranking of places per team-day (targets 3.3 and 4.a).</w:t>
+        <w:t xml:space="preserve">An editable table of barangays with residents, mosquitoes per resident, share of the day away, and attraction, with the matrix</w:t>
+      </w:r>
+      <w:r>
+        <w:t xml:space="preserve"> </w:t>
+      </w:r>
+      <w:r>
+        <w:rPr>
+          <w:iCs/>
+          <w:i/>
+        </w:rPr>
+        <w:t xml:space="preserve">P</w:t>
+      </w:r>
+      <w:r>
+        <w:t xml:space="preserve"> </w:t>
+      </w:r>
+      <w:r>
+        <w:t xml:space="preserve">shown as a heat map.</w:t>
       </w:r>
     </w:p>
     <w:p>
@@ -28016,7 +28137,7 @@
           <w:bCs/>
           <w:b/>
         </w:rPr>
-        <w:t xml:space="preserve">Control</w:t>
+        <w:t xml:space="preserve">Transmission</w:t>
       </w:r>
     </w:p>
     <w:p>
@@ -28028,7 +28149,7 @@
         <w:pStyle w:val="Compact"/>
       </w:pPr>
       <w:r>
-        <w:t xml:space="preserve">The five strategies of Section 2.10 side by side, with the exact plan of Algorithm 1 and its certified interval (target 3.3).</w:t>
+        <w:t xml:space="preserve">The network reproduction number, the local exposure numbers with the bounds of Proposition 4, and the province-average value of Proposition 5 (target 3.3).</w:t>
       </w:r>
     </w:p>
     <w:p>
@@ -28040,7 +28161,7 @@
         <w:pStyle w:val="Compact"/>
       </w:pPr>
       <w:r>
-        <w:t xml:space="preserve">A season slider that rescales mosquito numbers and recomputes the plan.</w:t>
+        <w:t xml:space="preserve">A bar chart of residents, cases by residence, and transmission by place, and a ranking of places per team-day (targets 3.3 and 4.a).</w:t>
       </w:r>
     </w:p>
     <w:p>
@@ -28052,7 +28173,7 @@
           <w:bCs/>
           <w:b/>
         </w:rPr>
-        <w:t xml:space="preserve">Surveillance</w:t>
+        <w:t xml:space="preserve">Control</w:t>
       </w:r>
     </w:p>
     <w:p>
@@ -28064,7 +28185,7 @@
         <w:pStyle w:val="Compact"/>
       </w:pPr>
       <w:r>
-        <w:t xml:space="preserve">A form that turns weekly cases by residence into infections by place with the error bound of Proposition 11.</w:t>
+        <w:t xml:space="preserve">The five strategies of Section 2.10 side by side, with the exact plan of Algorithm 1 and its certified interval (target 3.3).</w:t>
       </w:r>
     </w:p>
     <w:p>
@@ -28076,19 +28197,7 @@
         <w:pStyle w:val="Compact"/>
       </w:pPr>
       <w:r>
-        <w:t xml:space="preserve">The CUSUM alarm with a chosen false-alarm rate, plotted against the single-week rule (target 3.d).</w:t>
-      </w:r>
-    </w:p>
-    <w:p>
-      <w:pPr>
-        <w:numPr>
-          <w:ilvl w:val="0"/>
-          <w:numId w:val="1011"/>
-        </w:numPr>
-        <w:pStyle w:val="Compact"/>
-      </w:pPr>
-      <w:r>
-        <w:t xml:space="preserve">The Department of Health 4S checklist for households and schools.</w:t>
+        <w:t xml:space="preserve">A season slider that rescales mosquito numbers and recomputes the plan.</w:t>
       </w:r>
     </w:p>
     <w:p>
@@ -28100,7 +28209,7 @@
           <w:bCs/>
           <w:b/>
         </w:rPr>
-        <w:t xml:space="preserve">Use without a signal</w:t>
+        <w:t xml:space="preserve">Surveillance</w:t>
       </w:r>
     </w:p>
     <w:p>
@@ -28112,11 +28221,59 @@
         <w:pStyle w:val="Compact"/>
       </w:pPr>
       <w:r>
+        <w:t xml:space="preserve">A form that turns weekly cases by residence into infections by place with the error bound of Proposition 11.</w:t>
+      </w:r>
+    </w:p>
+    <w:p>
+      <w:pPr>
+        <w:numPr>
+          <w:ilvl w:val="0"/>
+          <w:numId w:val="1012"/>
+        </w:numPr>
+        <w:pStyle w:val="Compact"/>
+      </w:pPr>
+      <w:r>
+        <w:t xml:space="preserve">The CUSUM alarm with a chosen false-alarm rate, plotted against the single-week rule (target 3.d).</w:t>
+      </w:r>
+    </w:p>
+    <w:p>
+      <w:pPr>
+        <w:numPr>
+          <w:ilvl w:val="0"/>
+          <w:numId w:val="1012"/>
+        </w:numPr>
+        <w:pStyle w:val="Compact"/>
+      </w:pPr>
+      <w:r>
+        <w:t xml:space="preserve">The Department of Health 4S checklist for households and schools.</w:t>
+      </w:r>
+    </w:p>
+    <w:p>
+      <w:pPr>
+        <w:pStyle w:val="FirstParagraph"/>
+      </w:pPr>
+      <w:r>
+        <w:rPr>
+          <w:bCs/>
+          <w:b/>
+        </w:rPr>
+        <w:t xml:space="preserve">Use without a signal</w:t>
+      </w:r>
+    </w:p>
+    <w:p>
+      <w:pPr>
+        <w:numPr>
+          <w:ilvl w:val="0"/>
+          <w:numId w:val="1013"/>
+        </w:numPr>
+        <w:pStyle w:val="Compact"/>
+      </w:pPr>
+      <w:r>
         <w:t xml:space="preserve">All computation runs in the browser and works offline once installed; data can be exported and imported as JSON or CSV.</w:t>
       </w:r>
     </w:p>
-    <w:bookmarkEnd w:id="153"/>
-    <w:bookmarkStart w:id="154" w:name="appendix-e.-risk-register"/>
+    <w:bookmarkEnd w:id="157"/>
+    <w:bookmarkStart w:id="158" w:name="appendix-e.-risk-register"/>
     <w:p>
       <w:pPr>
         <w:pStyle w:val="Heading1"/>
@@ -28533,8 +28690,8 @@
         </w:tc>
       </w:tr>
     </w:tbl>
-    <w:bookmarkEnd w:id="154"/>
-    <w:bookmarkStart w:id="155" w:name="Xd92622ecd706be3ddeef7e19862d4bdeff526da"/>
+    <w:bookmarkEnd w:id="158"/>
+    <w:bookmarkStart w:id="159" w:name="Xd92622ecd706be3ddeef7e19862d4bdeff526da"/>
     <w:p>
       <w:pPr>
         <w:pStyle w:val="Heading1"/>
@@ -28579,7 +28736,7 @@
       <w:pPr>
         <w:numPr>
           <w:ilvl w:val="0"/>
-          <w:numId w:val="1013"/>
+          <w:numId w:val="1014"/>
         </w:numPr>
         <w:pStyle w:val="Compact"/>
       </w:pPr>
@@ -28591,7 +28748,7 @@
       <w:pPr>
         <w:numPr>
           <w:ilvl w:val="0"/>
-          <w:numId w:val="1013"/>
+          <w:numId w:val="1014"/>
         </w:numPr>
         <w:pStyle w:val="Compact"/>
       </w:pPr>
@@ -28603,7 +28760,7 @@
       <w:pPr>
         <w:numPr>
           <w:ilvl w:val="0"/>
-          <w:numId w:val="1013"/>
+          <w:numId w:val="1014"/>
         </w:numPr>
         <w:pStyle w:val="Compact"/>
       </w:pPr>
@@ -28615,7 +28772,7 @@
       <w:pPr>
         <w:numPr>
           <w:ilvl w:val="0"/>
-          <w:numId w:val="1013"/>
+          <w:numId w:val="1014"/>
         </w:numPr>
         <w:pStyle w:val="Compact"/>
       </w:pPr>
@@ -28627,7 +28784,7 @@
       <w:pPr>
         <w:numPr>
           <w:ilvl w:val="0"/>
-          <w:numId w:val="1013"/>
+          <w:numId w:val="1014"/>
         </w:numPr>
         <w:pStyle w:val="Compact"/>
       </w:pPr>
@@ -28639,7 +28796,7 @@
       <w:pPr>
         <w:numPr>
           <w:ilvl w:val="0"/>
-          <w:numId w:val="1013"/>
+          <w:numId w:val="1014"/>
         </w:numPr>
         <w:pStyle w:val="Compact"/>
       </w:pPr>
@@ -28682,8 +28839,8 @@
         <w:t xml:space="preserve">, from which every number in Chapter 3 is filled in. All of these numbers come from synthetic inputs.</w:t>
       </w:r>
     </w:p>
-    <w:bookmarkEnd w:id="155"/>
-    <w:bookmarkStart w:id="156" w:name="ethics-statement"/>
+    <w:bookmarkEnd w:id="159"/>
+    <w:bookmarkStart w:id="160" w:name="ethics-statement"/>
     <w:p>
       <w:pPr>
         <w:pStyle w:val="Heading1"/>
@@ -28708,7 +28865,7 @@
         <w:t xml:space="preserve">The protocol goes to the school’s Scientific Review Committee before the model touches Albay data, and the health offices that hold case and survey records will be asked for them only as counts per barangay per week. Rankings of barangays will be returned to those offices and not published as lists. The results in this paper describe a model, not the dengue situation of any real place.</w:t>
       </w:r>
     </w:p>
-    <w:bookmarkEnd w:id="156"/>
+    <w:bookmarkEnd w:id="160"/>
     <w:sectPr>
       <w:footerReference w:type="default" r:id="rIdFooterPg"/>
       <w:pgSz w:w="12240" w:h="15840"/>
@@ -29474,6 +29631,9 @@
     <w:abstractNumId w:val="991"/>
   </w:num>
   <w:num w:numId="1005">
+    <w:abstractNumId w:val="991"/>
+  </w:num>
+  <w:num w:numId="1006">
     <w:abstractNumId w:val="99533"/>
     <w:lvlOverride w:ilvl="0">
       <w:startOverride w:val="3"/>
@@ -29503,13 +29663,13 @@
       <w:startOverride w:val="3"/>
     </w:lvlOverride>
   </w:num>
-  <w:num w:numId="1006">
-    <w:abstractNumId w:val="991"/>
-  </w:num>
   <w:num w:numId="1007">
     <w:abstractNumId w:val="991"/>
   </w:num>
   <w:num w:numId="1008">
+    <w:abstractNumId w:val="991"/>
+  </w:num>
+  <w:num w:numId="1009">
     <w:abstractNumId w:val="99411"/>
     <w:lvlOverride w:ilvl="0">
       <w:startOverride w:val="1"/>
@@ -29539,7 +29699,7 @@
       <w:startOverride w:val="1"/>
     </w:lvlOverride>
   </w:num>
-  <w:num w:numId="1009">
+  <w:num w:numId="1010">
     <w:abstractNumId w:val="99412"/>
     <w:lvlOverride w:ilvl="0">
       <w:startOverride w:val="2"/>
@@ -29569,7 +29729,7 @@
       <w:startOverride w:val="2"/>
     </w:lvlOverride>
   </w:num>
-  <w:num w:numId="1010">
+  <w:num w:numId="1011">
     <w:abstractNumId w:val="99414"/>
     <w:lvlOverride w:ilvl="0">
       <w:startOverride w:val="4"/>
@@ -29599,7 +29759,7 @@
       <w:startOverride w:val="4"/>
     </w:lvlOverride>
   </w:num>
-  <w:num w:numId="1011">
+  <w:num w:numId="1012">
     <w:abstractNumId w:val="99416"/>
     <w:lvlOverride w:ilvl="0">
       <w:startOverride w:val="6"/>
@@ -29629,7 +29789,7 @@
       <w:startOverride w:val="6"/>
     </w:lvlOverride>
   </w:num>
-  <w:num w:numId="1012">
+  <w:num w:numId="1013">
     <w:abstractNumId w:val="99419"/>
     <w:lvlOverride w:ilvl="0">
       <w:startOverride w:val="9"/>
@@ -29659,7 +29819,7 @@
       <w:startOverride w:val="9"/>
     </w:lvlOverride>
   </w:num>
-  <w:num w:numId="1013">
+  <w:num w:numId="1014">
     <w:abstractNumId w:val="99411"/>
     <w:lvlOverride w:ilvl="0">
       <w:startOverride w:val="1"/>

</xml_diff>